<commit_message>
feat: custom metrics buckets for microservices and finalize Etape 2
</commit_message>
<xml_diff>
--- a/pulse-campus/RAPPORT.docx
+++ b/pulse-campus/RAPPORT.docx
@@ -1522,11 +1522,199 @@
         <w:pStyle w:val="FirstParagraph"/>
       </w:pPr>
       <w:r>
-        <w:rPr>
-          <w:i/>
-          <w:iCs/>
-        </w:rPr>
-        <w:t xml:space="preserve">[Remplir ici votre justification des buckets en fonction des SLOs de l’Étape 1.]</w:t>
+        <w:t xml:space="preserve">Les buckets ont été calibrés de façon à encadrer précisément les SLOs de latence définis à l’Étape 1 afin de garantir une interpolation linéaire exacte pour le calcul des quantiles :</w:t>
+      </w:r>
+      <w:r>
+        <w:t xml:space="preserve"> </w:t>
+      </w:r>
+      <w:r>
+        <w:t xml:space="preserve">*</w:t>
+      </w:r>
+      <w:r>
+        <w:t xml:space="preserve"> </w:t>
+      </w:r>
+      <w:r>
+        <w:rPr>
+          <w:b/>
+          <w:bCs/>
+        </w:rPr>
+        <w:t xml:space="preserve">Service</w:t>
+      </w:r>
+      <w:r>
+        <w:rPr>
+          <w:b/>
+          <w:bCs/>
+        </w:rPr>
+        <w:t xml:space="preserve"> </w:t>
+      </w:r>
+      <w:r>
+        <w:rPr>
+          <w:rStyle w:val="VerbatimChar"/>
+          <w:b/>
+          <w:bCs/>
+        </w:rPr>
+        <w:t xml:space="preserve">annuaire</w:t>
+      </w:r>
+      <w:r>
+        <w:t xml:space="preserve"> </w:t>
+      </w:r>
+      <w:r>
+        <w:t xml:space="preserve">(SLO p95 &lt; 300ms) : Buckets</w:t>
+      </w:r>
+      <w:r>
+        <w:t xml:space="preserve"> </w:t>
+      </w:r>
+      <w:r>
+        <w:rPr>
+          <w:rStyle w:val="VerbatimChar"/>
+        </w:rPr>
+        <w:t xml:space="preserve">0.05, 0.1, 0.2, 0.3, 0.5, 1, 2</w:t>
+      </w:r>
+      <w:r>
+        <w:t xml:space="preserve">. Nous avons inséré un bucket exact à</w:t>
+      </w:r>
+      <w:r>
+        <w:t xml:space="preserve"> </w:t>
+      </w:r>
+      <w:r>
+        <w:rPr>
+          <w:rStyle w:val="VerbatimChar"/>
+        </w:rPr>
+        <w:t xml:space="preserve">0.3</w:t>
+      </w:r>
+      <w:r>
+        <w:t xml:space="preserve"> </w:t>
+      </w:r>
+      <w:r>
+        <w:t xml:space="preserve">(300ms) pour surveiller le respect direct du SLO.</w:t>
+      </w:r>
+      <w:r>
+        <w:t xml:space="preserve"> </w:t>
+      </w:r>
+      <w:r>
+        <w:t xml:space="preserve">*</w:t>
+      </w:r>
+      <w:r>
+        <w:t xml:space="preserve"> </w:t>
+      </w:r>
+      <w:r>
+        <w:rPr>
+          <w:b/>
+          <w:bCs/>
+        </w:rPr>
+        <w:t xml:space="preserve">Service</w:t>
+      </w:r>
+      <w:r>
+        <w:rPr>
+          <w:b/>
+          <w:bCs/>
+        </w:rPr>
+        <w:t xml:space="preserve"> </w:t>
+      </w:r>
+      <w:r>
+        <w:rPr>
+          <w:rStyle w:val="VerbatimChar"/>
+          <w:b/>
+          <w:bCs/>
+        </w:rPr>
+        <w:t xml:space="preserve">planning</w:t>
+      </w:r>
+      <w:r>
+        <w:t xml:space="preserve"> </w:t>
+      </w:r>
+      <w:r>
+        <w:t xml:space="preserve">(SLO p95 &lt; 500ms) : Buckets</w:t>
+      </w:r>
+      <w:r>
+        <w:t xml:space="preserve"> </w:t>
+      </w:r>
+      <w:r>
+        <w:rPr>
+          <w:rStyle w:val="VerbatimChar"/>
+        </w:rPr>
+        <w:t xml:space="preserve">0.05, 0.1, 0.2, 0.3, 0.5, 1, 2, 5</w:t>
+      </w:r>
+      <w:r>
+        <w:t xml:space="preserve">. Le bucket à</w:t>
+      </w:r>
+      <w:r>
+        <w:t xml:space="preserve"> </w:t>
+      </w:r>
+      <w:r>
+        <w:rPr>
+          <w:rStyle w:val="VerbatimChar"/>
+        </w:rPr>
+        <w:t xml:space="preserve">0.5</w:t>
+      </w:r>
+      <w:r>
+        <w:t xml:space="preserve"> </w:t>
+      </w:r>
+      <w:r>
+        <w:t xml:space="preserve">(500ms) cible l’exactitude à la limite de notre SLO.</w:t>
+      </w:r>
+      <w:r>
+        <w:t xml:space="preserve"> </w:t>
+      </w:r>
+      <w:r>
+        <w:t xml:space="preserve">*</w:t>
+      </w:r>
+      <w:r>
+        <w:t xml:space="preserve"> </w:t>
+      </w:r>
+      <w:r>
+        <w:rPr>
+          <w:b/>
+          <w:bCs/>
+        </w:rPr>
+        <w:t xml:space="preserve">Service</w:t>
+      </w:r>
+      <w:r>
+        <w:rPr>
+          <w:b/>
+          <w:bCs/>
+        </w:rPr>
+        <w:t xml:space="preserve"> </w:t>
+      </w:r>
+      <w:r>
+        <w:rPr>
+          <w:rStyle w:val="VerbatimChar"/>
+          <w:b/>
+          <w:bCs/>
+        </w:rPr>
+        <w:t xml:space="preserve">notif</w:t>
+      </w:r>
+      <w:r>
+        <w:t xml:space="preserve"> </w:t>
+      </w:r>
+      <w:r>
+        <w:t xml:space="preserve">(SLO p95 &lt; 2s) : Buckets</w:t>
+      </w:r>
+      <w:r>
+        <w:t xml:space="preserve"> </w:t>
+      </w:r>
+      <w:r>
+        <w:rPr>
+          <w:rStyle w:val="VerbatimChar"/>
+        </w:rPr>
+        <w:t xml:space="preserve">0.05, 0.1, 0.5, 1, 2, 5, 10</w:t>
+      </w:r>
+      <w:r>
+        <w:t xml:space="preserve">. Le bucket à</w:t>
+      </w:r>
+      <w:r>
+        <w:t xml:space="preserve"> </w:t>
+      </w:r>
+      <w:r>
+        <w:rPr>
+          <w:rStyle w:val="VerbatimChar"/>
+        </w:rPr>
+        <w:t xml:space="preserve">2</w:t>
+      </w:r>
+      <w:r>
+        <w:t xml:space="preserve"> </w:t>
+      </w:r>
+      <w:r>
+        <w:t xml:space="preserve">(2 secondes) cible la limite de traitement de la file.</w:t>
       </w:r>
     </w:p>
     <w:bookmarkEnd w:id="24"/>
@@ -1553,11 +1741,197 @@
         <w:pStyle w:val="FirstParagraph"/>
       </w:pPr>
       <w:r>
-        <w:rPr>
-          <w:i/>
-          <w:iCs/>
-        </w:rPr>
-        <w:t xml:space="preserve">[Insérer une capture d’écran montrant les buckets effectifs retournés par le service.]</w:t>
+        <w:t xml:space="preserve">Voici un extrait de la sortie du endpoint</w:t>
+      </w:r>
+      <w:r>
+        <w:t xml:space="preserve"> </w:t>
+      </w:r>
+      <w:r>
+        <w:rPr>
+          <w:rStyle w:val="VerbatimChar"/>
+        </w:rPr>
+        <w:t xml:space="preserve">/metrics</w:t>
+      </w:r>
+      <w:r>
+        <w:t xml:space="preserve"> </w:t>
+      </w:r>
+      <w:r>
+        <w:t xml:space="preserve">validée avec</w:t>
+      </w:r>
+      <w:r>
+        <w:t xml:space="preserve"> </w:t>
+      </w:r>
+      <w:r>
+        <w:rPr>
+          <w:rStyle w:val="VerbatimChar"/>
+        </w:rPr>
+        <w:t xml:space="preserve">promtool</w:t>
+      </w:r>
+      <w:r>
+        <w:t xml:space="preserve"> </w:t>
+      </w:r>
+      <w:r>
+        <w:t xml:space="preserve">montrant les buckets effectifs sur le service</w:t>
+      </w:r>
+      <w:r>
+        <w:t xml:space="preserve"> </w:t>
+      </w:r>
+      <w:r>
+        <w:rPr>
+          <w:rStyle w:val="VerbatimChar"/>
+        </w:rPr>
+        <w:t xml:space="preserve">annuaire</w:t>
+      </w:r>
+      <w:r>
+        <w:t xml:space="preserve"> </w:t>
+      </w:r>
+      <w:r>
+        <w:t xml:space="preserve">:</w:t>
+      </w:r>
+    </w:p>
+    <w:p>
+      <w:pPr>
+        <w:pStyle w:val="SourceCode"/>
+      </w:pPr>
+      <w:r>
+        <w:rPr>
+          <w:rStyle w:val="VerbatimChar"/>
+        </w:rPr>
+        <w:t xml:space="preserve"># HELP http_request_duration_seconds Durée des requêtes HTTP en secondes.</w:t>
+      </w:r>
+      <w:r>
+        <w:br/>
+      </w:r>
+      <w:r>
+        <w:rPr>
+          <w:rStyle w:val="VerbatimChar"/>
+        </w:rPr>
+        <w:t xml:space="preserve"># TYPE http_request_duration_seconds histogram</w:t>
+      </w:r>
+      <w:r>
+        <w:br/>
+      </w:r>
+      <w:r>
+        <w:rPr>
+          <w:rStyle w:val="VerbatimChar"/>
+        </w:rPr>
+        <w:t xml:space="preserve">http_request_duration_seconds_bucket{le="0.05",method="GET",route="/students",status_class="2xx"} 1</w:t>
+      </w:r>
+      <w:r>
+        <w:br/>
+      </w:r>
+      <w:r>
+        <w:rPr>
+          <w:rStyle w:val="VerbatimChar"/>
+        </w:rPr>
+        <w:t xml:space="preserve">http_request_duration_seconds_bucket{le="0.1",method="GET",route="/students",status_class="2xx"} 1</w:t>
+      </w:r>
+      <w:r>
+        <w:br/>
+      </w:r>
+      <w:r>
+        <w:rPr>
+          <w:rStyle w:val="VerbatimChar"/>
+        </w:rPr>
+        <w:t xml:space="preserve">http_request_duration_seconds_bucket{le="0.2",method="GET",route="/students",status_class="2xx"} 1</w:t>
+      </w:r>
+      <w:r>
+        <w:br/>
+      </w:r>
+      <w:r>
+        <w:rPr>
+          <w:rStyle w:val="VerbatimChar"/>
+        </w:rPr>
+        <w:t xml:space="preserve">http_request_duration_seconds_bucket{le="0.3",method="GET",route="/students",status_class="2xx"} 1</w:t>
+      </w:r>
+      <w:r>
+        <w:br/>
+      </w:r>
+      <w:r>
+        <w:rPr>
+          <w:rStyle w:val="VerbatimChar"/>
+        </w:rPr>
+        <w:t xml:space="preserve">http_request_duration_seconds_bucket{le="0.5",method="GET",route="/students",status_class="2xx"} 1</w:t>
+      </w:r>
+      <w:r>
+        <w:br/>
+      </w:r>
+      <w:r>
+        <w:rPr>
+          <w:rStyle w:val="VerbatimChar"/>
+        </w:rPr>
+        <w:t xml:space="preserve">http_request_duration_seconds_bucket{le="1",method="GET",route="/students",status_class="2xx"} 1</w:t>
+      </w:r>
+      <w:r>
+        <w:br/>
+      </w:r>
+      <w:r>
+        <w:rPr>
+          <w:rStyle w:val="VerbatimChar"/>
+        </w:rPr>
+        <w:t xml:space="preserve">http_request_duration_seconds_bucket{le="2",method="GET",route="/students",status_class="2xx"} 1</w:t>
+      </w:r>
+      <w:r>
+        <w:br/>
+      </w:r>
+      <w:r>
+        <w:rPr>
+          <w:rStyle w:val="VerbatimChar"/>
+        </w:rPr>
+        <w:t xml:space="preserve">http_request_duration_seconds_bucket{le="+Inf",method="GET",route="/students",status_class="2xx"} 1</w:t>
+      </w:r>
+      <w:r>
+        <w:br/>
+      </w:r>
+      <w:r>
+        <w:rPr>
+          <w:rStyle w:val="VerbatimChar"/>
+        </w:rPr>
+        <w:t xml:space="preserve">http_request_duration_seconds_sum{method="GET",route="/students",status_class="2xx"} 0.004065923</w:t>
+      </w:r>
+      <w:r>
+        <w:br/>
+      </w:r>
+      <w:r>
+        <w:rPr>
+          <w:rStyle w:val="VerbatimChar"/>
+        </w:rPr>
+        <w:t xml:space="preserve">http_request_duration_seconds_count{method="GET",route="/students",status_class="2xx"} 1</w:t>
+      </w:r>
+    </w:p>
+    <w:p>
+      <w:pPr>
+        <w:pStyle w:val="BlockText"/>
+      </w:pPr>
+      <w:r>
+        <w:t xml:space="preserve">Pour</w:t>
+      </w:r>
+      <w:r>
+        <w:t xml:space="preserve"> </w:t>
+      </w:r>
+      <w:r>
+        <w:rPr>
+          <w:rStyle w:val="VerbatimChar"/>
+        </w:rPr>
+        <w:t xml:space="preserve">annuaire</w:t>
+      </w:r>
+      <w:r>
+        <w:t xml:space="preserve">, mes buckets sont</w:t>
+      </w:r>
+      <w:r>
+        <w:t xml:space="preserve"> </w:t>
+      </w:r>
+      <w:r>
+        <w:rPr>
+          <w:rStyle w:val="VerbatimChar"/>
+        </w:rPr>
+        <w:t xml:space="preserve">0.05, 0.1, 0.2, 0.3, 0.5, 1, 2</w:t>
+      </w:r>
+      <w:r>
+        <w:t xml:space="preserve"> </w:t>
+      </w:r>
+      <w:r>
+        <w:t xml:space="preserve">parce que mon SLO p95 est de 300 ms (0.3s), ce qui permet à Prometheus d’avoir une précision optimale lors de l’estimation de la latence de nos percentiles à ce seuil critique.</w:t>
       </w:r>
     </w:p>
     <w:p>

</xml_diff>

<commit_message>
docs: finalize Etape 3 and update links in report
</commit_message>
<xml_diff>
--- a/pulse-campus/RAPPORT.docx
+++ b/pulse-campus/RAPPORT.docx
@@ -2,7 +2,7 @@
 <file path=word/document.xml><?xml version="1.0" encoding="utf-8"?>
 <w:document xmlns:w="http://schemas.openxmlformats.org/wordprocessingml/2006/main" xmlns:m="http://schemas.openxmlformats.org/officeDocument/2006/math" xmlns:r="http://schemas.openxmlformats.org/officeDocument/2006/relationships" xmlns:o="urn:schemas-microsoft-com:office:office" xmlns:v="urn:schemas-microsoft-com:vml" xmlns:w10="urn:schemas-microsoft-com:office:word" xmlns:a="http://schemas.openxmlformats.org/drawingml/2006/main" xmlns:pic="http://schemas.openxmlformats.org/drawingml/2006/picture" xmlns:wp="http://schemas.openxmlformats.org/drawingml/2006/wordprocessingDrawing">
   <w:body>
-    <w:bookmarkStart w:id="62" w:name="Xb085d4ceeae88009f4c3cbd205ab9ae93c8917e"/>
+    <w:bookmarkStart w:id="64" w:name="Xb085d4ceeae88009f4c3cbd205ab9ae93c8917e"/>
     <w:p>
       <w:pPr>
         <w:pStyle w:val="Heading1"/>
@@ -1943,7 +1943,7 @@
     </w:p>
     <w:bookmarkEnd w:id="25"/>
     <w:bookmarkEnd w:id="26"/>
-    <w:bookmarkStart w:id="29" w:name="X702f9773a8b3b9ce1221e21c311c19155d61e14"/>
+    <w:bookmarkStart w:id="31" w:name="X702f9773a8b3b9ce1221e21c311c19155d61e14"/>
     <w:p>
       <w:pPr>
         <w:pStyle w:val="Heading2"/>
@@ -1952,7 +1952,7 @@
         <w:t xml:space="preserve">Étape 3 — Installer kube-prometheus-stack via ArgoCD</w:t>
       </w:r>
     </w:p>
-    <w:bookmarkStart w:id="27" w:name="X53879a8e2ce84c1e2a9e6d9067502178723c70d"/>
+    <w:bookmarkStart w:id="29" w:name="X53879a8e2ce84c1e2a9e6d9067502178723c70d"/>
     <w:p>
       <w:pPr>
         <w:pStyle w:val="Heading3"/>
@@ -1974,7 +1974,7 @@
           <w:b/>
           <w:bCs/>
         </w:rPr>
-        <w:t xml:space="preserve">Lien vers le manifeste de l’application parent</w:t>
+        <w:t xml:space="preserve">Manifeste de l’application parent</w:t>
       </w:r>
       <w:r>
         <w:t xml:space="preserve"> </w:t>
@@ -1985,12 +1985,14 @@
       <w:r>
         <w:t xml:space="preserve"> </w:t>
       </w:r>
-      <w:r>
-        <w:rPr>
-          <w:rStyle w:val="VerbatimChar"/>
-        </w:rPr>
-        <w:t xml:space="preserve">platform-sre/apps/observability/kube-prometheus-stack.yaml</w:t>
-      </w:r>
+      <w:hyperlink r:id="rId27">
+        <w:r>
+          <w:rPr>
+            <w:rStyle w:val="Hyperlink"/>
+          </w:rPr>
+          <w:t xml:space="preserve">kube-prometheus-stack.yaml</w:t>
+        </w:r>
+      </w:hyperlink>
     </w:p>
     <w:p>
       <w:pPr>
@@ -2005,7 +2007,7 @@
           <w:b/>
           <w:bCs/>
         </w:rPr>
-        <w:t xml:space="preserve">Lien vers les values du chart</w:t>
+        <w:t xml:space="preserve">Values du chart</w:t>
       </w:r>
       <w:r>
         <w:t xml:space="preserve"> </w:t>
@@ -2016,15 +2018,17 @@
       <w:r>
         <w:t xml:space="preserve"> </w:t>
       </w:r>
-      <w:r>
-        <w:rPr>
-          <w:rStyle w:val="VerbatimChar"/>
-        </w:rPr>
-        <w:t xml:space="preserve">platform-sre/values/kube-prometheus-stack.yaml</w:t>
-      </w:r>
-    </w:p>
-    <w:bookmarkEnd w:id="27"/>
-    <w:bookmarkStart w:id="28" w:name="X8c01df416b28e25850ca1f6c88279dd34fa71c6"/>
+      <w:hyperlink r:id="rId28">
+        <w:r>
+          <w:rPr>
+            <w:rStyle w:val="Hyperlink"/>
+          </w:rPr>
+          <w:t xml:space="preserve">kube-prometheus-stack-values.yaml</w:t>
+        </w:r>
+      </w:hyperlink>
+    </w:p>
+    <w:bookmarkEnd w:id="29"/>
+    <w:bookmarkStart w:id="30" w:name="X8c01df416b28e25850ca1f6c88279dd34fa71c6"/>
     <w:p>
       <w:pPr>
         <w:pStyle w:val="Heading3"/>
@@ -2042,7 +2046,105 @@
           <w:i/>
           <w:iCs/>
         </w:rPr>
-        <w:t xml:space="preserve">[Insérer la capture d’écran de l’UI ArgoCD montrant l’application et ses Pods (Prometheus, Grafana, exporter) au vert.]</w:t>
+        <w:t xml:space="preserve">[ACTION REQUISE : Prenez une capture d’écran de votre interface ArgoCD pour l’application</w:t>
+      </w:r>
+      <w:r>
+        <w:rPr>
+          <w:i/>
+          <w:iCs/>
+        </w:rPr>
+        <w:t xml:space="preserve"> </w:t>
+      </w:r>
+      <w:r>
+        <w:rPr>
+          <w:i/>
+          <w:iCs/>
+        </w:rPr>
+        <w:t xml:space="preserve">“kube-prometheus-stack”</w:t>
+      </w:r>
+      <w:r>
+        <w:rPr>
+          <w:i/>
+          <w:iCs/>
+        </w:rPr>
+        <w:t xml:space="preserve"> </w:t>
+      </w:r>
+      <w:r>
+        <w:rPr>
+          <w:i/>
+          <w:iCs/>
+        </w:rPr>
+        <w:t xml:space="preserve">montrant tous les composants au statut Synced &amp; Healthy, puis insérez-la ci-dessous.]</w:t>
+      </w:r>
+    </w:p>
+    <w:p>
+      <w:pPr>
+        <w:pStyle w:val="BodyText"/>
+      </w:pPr>
+      <w:r>
+        <w:rPr>
+          <w:i/>
+          <w:iCs/>
+        </w:rPr>
+        <w:t xml:space="preserve">(Note : Tous les pods de la stack (Grafana, Operator, NodeExporter, Prometheus, StateMetrics) sont bien</w:t>
+      </w:r>
+      <w:r>
+        <w:rPr>
+          <w:i/>
+          <w:iCs/>
+        </w:rPr>
+        <w:t xml:space="preserve"> </w:t>
+      </w:r>
+      <w:r>
+        <w:rPr>
+          <w:rStyle w:val="VerbatimChar"/>
+          <w:i/>
+          <w:iCs/>
+        </w:rPr>
+        <w:t xml:space="preserve">Running</w:t>
+      </w:r>
+      <w:r>
+        <w:rPr>
+          <w:i/>
+          <w:iCs/>
+        </w:rPr>
+        <w:t xml:space="preserve"> </w:t>
+      </w:r>
+      <w:r>
+        <w:rPr>
+          <w:i/>
+          <w:iCs/>
+        </w:rPr>
+        <w:t xml:space="preserve">et opérationnels dans le namespace</w:t>
+      </w:r>
+      <w:r>
+        <w:rPr>
+          <w:i/>
+          <w:iCs/>
+        </w:rPr>
+        <w:t xml:space="preserve"> </w:t>
+      </w:r>
+      <w:r>
+        <w:rPr>
+          <w:rStyle w:val="VerbatimChar"/>
+          <w:i/>
+          <w:iCs/>
+        </w:rPr>
+        <w:t xml:space="preserve">monitoring</w:t>
+      </w:r>
+      <w:r>
+        <w:rPr>
+          <w:i/>
+          <w:iCs/>
+        </w:rPr>
+        <w:t xml:space="preserve"> </w:t>
+      </w:r>
+      <w:r>
+        <w:rPr>
+          <w:i/>
+          <w:iCs/>
+        </w:rPr>
+        <w:t xml:space="preserve">du cluster).</w:t>
       </w:r>
     </w:p>
     <w:p>
@@ -2052,9 +2154,9 @@
         </w:pict>
       </w:r>
     </w:p>
-    <w:bookmarkEnd w:id="28"/>
-    <w:bookmarkEnd w:id="29"/>
-    <w:bookmarkStart w:id="32" w:name="X652afbafe8673b02b7d127b85d3f179c5b7de32"/>
+    <w:bookmarkEnd w:id="30"/>
+    <w:bookmarkEnd w:id="31"/>
+    <w:bookmarkStart w:id="34" w:name="X652afbafe8673b02b7d127b85d3f179c5b7de32"/>
     <w:p>
       <w:pPr>
         <w:pStyle w:val="Heading2"/>
@@ -2063,7 +2165,7 @@
         <w:t xml:space="preserve">Étape 4 — Brancher votre service : ServiceMonitor + premier dashboard</w:t>
       </w:r>
     </w:p>
-    <w:bookmarkStart w:id="30" w:name="fichiers-de-configuration"/>
+    <w:bookmarkStart w:id="32" w:name="fichiers-de-configuration"/>
     <w:p>
       <w:pPr>
         <w:pStyle w:val="Heading3"/>
@@ -2134,8 +2236,8 @@
         <w:t xml:space="preserve">platform-sre/dashboards/[service].json</w:t>
       </w:r>
     </w:p>
-    <w:bookmarkEnd w:id="30"/>
-    <w:bookmarkStart w:id="31" w:name="X05fcd00c239621556cabf2e4d9d2e030d6dee12"/>
+    <w:bookmarkEnd w:id="32"/>
+    <w:bookmarkStart w:id="33" w:name="X05fcd00c239621556cabf2e4d9d2e030d6dee12"/>
     <w:p>
       <w:pPr>
         <w:pStyle w:val="Heading3"/>
@@ -2275,9 +2377,9 @@
         </w:pict>
       </w:r>
     </w:p>
-    <w:bookmarkEnd w:id="31"/>
-    <w:bookmarkEnd w:id="32"/>
-    <w:bookmarkStart w:id="35" w:name="étape-5-du-deployment-au-rollout"/>
+    <w:bookmarkEnd w:id="33"/>
+    <w:bookmarkEnd w:id="34"/>
+    <w:bookmarkStart w:id="37" w:name="étape-5-du-deployment-au-rollout"/>
     <w:p>
       <w:pPr>
         <w:pStyle w:val="Heading2"/>
@@ -2286,7 +2388,7 @@
         <w:t xml:space="preserve">Étape 5 — Du Deployment au Rollout</w:t>
       </w:r>
     </w:p>
-    <w:bookmarkStart w:id="33" w:name="fichiers-de-configuration-1"/>
+    <w:bookmarkStart w:id="35" w:name="fichiers-de-configuration-1"/>
     <w:p>
       <w:pPr>
         <w:pStyle w:val="Heading3"/>
@@ -2357,8 +2459,8 @@
         <w:t xml:space="preserve">templates/rollout.yaml</w:t>
       </w:r>
     </w:p>
-    <w:bookmarkEnd w:id="33"/>
-    <w:bookmarkStart w:id="34" w:name="capture-du-canary-en-cours"/>
+    <w:bookmarkEnd w:id="35"/>
+    <w:bookmarkStart w:id="36" w:name="capture-du-canary-en-cours"/>
     <w:p>
       <w:pPr>
         <w:pStyle w:val="Heading3"/>
@@ -2415,9 +2517,9 @@
         </w:pict>
       </w:r>
     </w:p>
-    <w:bookmarkEnd w:id="34"/>
-    <w:bookmarkEnd w:id="35"/>
-    <w:bookmarkStart w:id="41" w:name="Xc7a5a4a1669bf27094346f7cb9f7a61bc483680"/>
+    <w:bookmarkEnd w:id="36"/>
+    <w:bookmarkEnd w:id="37"/>
+    <w:bookmarkStart w:id="43" w:name="Xc7a5a4a1669bf27094346f7cb9f7a61bc483680"/>
     <w:p>
       <w:pPr>
         <w:pStyle w:val="Heading2"/>
@@ -2426,7 +2528,7 @@
         <w:t xml:space="preserve">Étape 6 — Canary manuel : pause, promote, abort</w:t>
       </w:r>
     </w:p>
-    <w:bookmarkStart w:id="39" w:name="X3dd8846d802fe5469b133df634ec839a619d22b"/>
+    <w:bookmarkStart w:id="41" w:name="X3dd8846d802fe5469b133df634ec839a619d22b"/>
     <w:p>
       <w:pPr>
         <w:pStyle w:val="Heading3"/>
@@ -2435,7 +2537,7 @@
         <w:t xml:space="preserve">1. Pilotage manuel : Les 3 scénarios documentés</w:t>
       </w:r>
     </w:p>
-    <w:bookmarkStart w:id="36" w:name="scénario-1-promotion-normale"/>
+    <w:bookmarkStart w:id="38" w:name="scénario-1-promotion-normale"/>
     <w:p>
       <w:pPr>
         <w:pStyle w:val="Heading4"/>
@@ -2497,8 +2599,8 @@
         <w:t xml:space="preserve">: [Détails]</w:t>
       </w:r>
     </w:p>
-    <w:bookmarkEnd w:id="36"/>
-    <w:bookmarkStart w:id="37" w:name="scénario-2-annulation-explicite-abort"/>
+    <w:bookmarkEnd w:id="38"/>
+    <w:bookmarkStart w:id="39" w:name="scénario-2-annulation-explicite-abort"/>
     <w:p>
       <w:pPr>
         <w:pStyle w:val="Heading4"/>
@@ -2560,8 +2662,8 @@
         <w:t xml:space="preserve">: [Détails]</w:t>
       </w:r>
     </w:p>
-    <w:bookmarkEnd w:id="37"/>
-    <w:bookmarkStart w:id="38" w:name="scénario-3-promotion-forcée-full"/>
+    <w:bookmarkEnd w:id="39"/>
+    <w:bookmarkStart w:id="40" w:name="scénario-3-promotion-forcée-full"/>
     <w:p>
       <w:pPr>
         <w:pStyle w:val="Heading4"/>
@@ -2623,9 +2725,9 @@
         <w:t xml:space="preserve">: [Détails]</w:t>
       </w:r>
     </w:p>
-    <w:bookmarkEnd w:id="38"/>
-    <w:bookmarkEnd w:id="39"/>
-    <w:bookmarkStart w:id="40" w:name="X7dbcb4f0d6eab82b24b1c934735d50db3993efb"/>
+    <w:bookmarkEnd w:id="40"/>
+    <w:bookmarkEnd w:id="41"/>
+    <w:bookmarkStart w:id="42" w:name="X7dbcb4f0d6eab82b24b1c934735d50db3993efb"/>
     <w:p>
       <w:pPr>
         <w:pStyle w:val="Heading3"/>
@@ -2664,9 +2766,9 @@
         </w:pict>
       </w:r>
     </w:p>
-    <w:bookmarkEnd w:id="40"/>
-    <w:bookmarkEnd w:id="41"/>
-    <w:bookmarkStart w:id="45" w:name="Xfa670e360291aaa624fb95e24517daba86d6754"/>
+    <w:bookmarkEnd w:id="42"/>
+    <w:bookmarkEnd w:id="43"/>
+    <w:bookmarkStart w:id="47" w:name="Xfa670e360291aaa624fb95e24517daba86d6754"/>
     <w:p>
       <w:pPr>
         <w:pStyle w:val="Heading2"/>
@@ -2675,7 +2777,7 @@
         <w:t xml:space="preserve">Étape 7 — AnalysisTemplate : La promotion sur preuve</w:t>
       </w:r>
     </w:p>
-    <w:bookmarkStart w:id="42" w:name="fichiers-de-configuration-2"/>
+    <w:bookmarkStart w:id="44" w:name="fichiers-de-configuration-2"/>
     <w:p>
       <w:pPr>
         <w:pStyle w:val="Heading3"/>
@@ -2715,8 +2817,8 @@
         <w:t xml:space="preserve">templates/analysistemplate.yaml</w:t>
       </w:r>
     </w:p>
-    <w:bookmarkEnd w:id="42"/>
-    <w:bookmarkStart w:id="43" w:name="captures-décrans-des-analysisruns"/>
+    <w:bookmarkEnd w:id="44"/>
+    <w:bookmarkStart w:id="45" w:name="captures-décrans-des-analysisruns"/>
     <w:p>
       <w:pPr>
         <w:pStyle w:val="Heading3"/>
@@ -2789,8 +2891,8 @@
         <w:t xml:space="preserve">[Insérer la capture]</w:t>
       </w:r>
     </w:p>
-    <w:bookmarkEnd w:id="43"/>
-    <w:bookmarkStart w:id="44" w:name="X2e7d2881f7b039fea1d377948030bdade82a569"/>
+    <w:bookmarkEnd w:id="45"/>
+    <w:bookmarkStart w:id="46" w:name="X2e7d2881f7b039fea1d377948030bdade82a569"/>
     <w:p>
       <w:pPr>
         <w:pStyle w:val="Heading3"/>
@@ -2818,9 +2920,9 @@
         </w:pict>
       </w:r>
     </w:p>
-    <w:bookmarkEnd w:id="44"/>
-    <w:bookmarkEnd w:id="45"/>
-    <w:bookmarkStart w:id="49" w:name="X650888a7878ecfd10f02440625a24c231940db3"/>
+    <w:bookmarkEnd w:id="46"/>
+    <w:bookmarkEnd w:id="47"/>
+    <w:bookmarkStart w:id="51" w:name="X650888a7878ecfd10f02440625a24c231940db3"/>
     <w:p>
       <w:pPr>
         <w:pStyle w:val="Heading2"/>
@@ -2829,7 +2931,7 @@
         <w:t xml:space="preserve">Étape 8 — Blue/Green : Autre stratégie, autre arbitrage</w:t>
       </w:r>
     </w:p>
-    <w:bookmarkStart w:id="46" w:name="fichiers-de-configuration-3"/>
+    <w:bookmarkStart w:id="48" w:name="fichiers-de-configuration-3"/>
     <w:p>
       <w:pPr>
         <w:pStyle w:val="Heading3"/>
@@ -2869,8 +2971,8 @@
         <w:t xml:space="preserve">templates/rollout.yaml</w:t>
       </w:r>
     </w:p>
-    <w:bookmarkEnd w:id="46"/>
-    <w:bookmarkStart w:id="47" w:name="tableau-comparatif-canary-vs.-bluegreen"/>
+    <w:bookmarkEnd w:id="48"/>
+    <w:bookmarkStart w:id="49" w:name="tableau-comparatif-canary-vs.-bluegreen"/>
     <w:p>
       <w:pPr>
         <w:pStyle w:val="Heading3"/>
@@ -2891,8 +2993,8 @@
         <w:t xml:space="preserve">[Insérer votre tableau comparatif présentant les avantages, inconvénients et cas d’usages respectifs.]</w:t>
       </w:r>
     </w:p>
-    <w:bookmarkEnd w:id="47"/>
-    <w:bookmarkStart w:id="48" w:name="capture-de-la-bascule-manuelle-réussie"/>
+    <w:bookmarkEnd w:id="49"/>
+    <w:bookmarkStart w:id="50" w:name="capture-de-la-bascule-manuelle-réussie"/>
     <w:p>
       <w:pPr>
         <w:pStyle w:val="Heading3"/>
@@ -2920,9 +3022,9 @@
         </w:pict>
       </w:r>
     </w:p>
-    <w:bookmarkEnd w:id="48"/>
-    <w:bookmarkEnd w:id="49"/>
-    <w:bookmarkStart w:id="52" w:name="Xd90a1630ead798ac2772b636ce240c5b913f93f"/>
+    <w:bookmarkEnd w:id="50"/>
+    <w:bookmarkEnd w:id="51"/>
+    <w:bookmarkStart w:id="54" w:name="Xd90a1630ead798ac2772b636ce240c5b913f93f"/>
     <w:p>
       <w:pPr>
         <w:pStyle w:val="Heading2"/>
@@ -2931,7 +3033,7 @@
         <w:t xml:space="preserve">Étape 9 — Routage avancé : Header-based pour les tests internes</w:t>
       </w:r>
     </w:p>
-    <w:bookmarkStart w:id="50" w:name="fichiers-de-configuration-4"/>
+    <w:bookmarkStart w:id="52" w:name="fichiers-de-configuration-4"/>
     <w:p>
       <w:pPr>
         <w:pStyle w:val="Heading3"/>
@@ -2971,8 +3073,8 @@
         <w:t xml:space="preserve">templates/ingress.yaml</w:t>
       </w:r>
     </w:p>
-    <w:bookmarkEnd w:id="50"/>
-    <w:bookmarkStart w:id="51" w:name="X2378407b785e7aa7079f26fe8abbcf7ac4b8d5c"/>
+    <w:bookmarkEnd w:id="52"/>
+    <w:bookmarkStart w:id="53" w:name="X2378407b785e7aa7079f26fe8abbcf7ac4b8d5c"/>
     <w:p>
       <w:pPr>
         <w:pStyle w:val="Heading3"/>
@@ -3029,9 +3131,9 @@
         </w:pict>
       </w:r>
     </w:p>
-    <w:bookmarkEnd w:id="51"/>
-    <w:bookmarkEnd w:id="52"/>
-    <w:bookmarkStart w:id="55" w:name="Xaa93b513a84bfd46879aafda0934d49925bde83"/>
+    <w:bookmarkEnd w:id="53"/>
+    <w:bookmarkEnd w:id="54"/>
+    <w:bookmarkStart w:id="57" w:name="Xaa93b513a84bfd46879aafda0934d49925bde83"/>
     <w:p>
       <w:pPr>
         <w:pStyle w:val="Heading2"/>
@@ -3040,7 +3142,7 @@
         <w:t xml:space="preserve">Étape 10 — Alerting Alertmanager et notifications Rollouts</w:t>
       </w:r>
     </w:p>
-    <w:bookmarkStart w:id="53" w:name="X30991d32a017905e182502f8ac1bf66caedec37"/>
+    <w:bookmarkStart w:id="55" w:name="X30991d32a017905e182502f8ac1bf66caedec37"/>
     <w:p>
       <w:pPr>
         <w:pStyle w:val="Heading3"/>
@@ -3142,8 +3244,8 @@
         <w:t xml:space="preserve">platform-sre/rollouts-notifications.yaml</w:t>
       </w:r>
     </w:p>
-    <w:bookmarkEnd w:id="53"/>
-    <w:bookmarkStart w:id="54" w:name="X2eadc02aa71306573a275a34697c4881cc775ab"/>
+    <w:bookmarkEnd w:id="55"/>
+    <w:bookmarkStart w:id="56" w:name="X2eadc02aa71306573a275a34697c4881cc775ab"/>
     <w:p>
       <w:pPr>
         <w:pStyle w:val="Heading3"/>
@@ -3255,9 +3357,9 @@
         </w:pict>
       </w:r>
     </w:p>
-    <w:bookmarkEnd w:id="54"/>
-    <w:bookmarkEnd w:id="55"/>
-    <w:bookmarkStart w:id="57" w:name="X3d2815aee2ea9cd95ddfc31f554cd07bb58a689"/>
+    <w:bookmarkEnd w:id="56"/>
+    <w:bookmarkEnd w:id="57"/>
+    <w:bookmarkStart w:id="59" w:name="X3d2815aee2ea9cd95ddfc31f554cd07bb58a689"/>
     <w:p>
       <w:pPr>
         <w:pStyle w:val="Heading2"/>
@@ -3266,7 +3368,7 @@
         <w:t xml:space="preserve">Étape 11 — Comparer Argo Rollouts, Flagger et la Rolling-Update native</w:t>
       </w:r>
     </w:p>
-    <w:bookmarkStart w:id="56" w:name="matrice-dévaluation-complétée"/>
+    <w:bookmarkStart w:id="58" w:name="matrice-dévaluation-complétée"/>
     <w:p>
       <w:pPr>
         <w:pStyle w:val="Heading3"/>
@@ -4022,9 +4124,9 @@
         </w:pict>
       </w:r>
     </w:p>
-    <w:bookmarkEnd w:id="56"/>
-    <w:bookmarkEnd w:id="57"/>
-    <w:bookmarkStart w:id="61" w:name="Xc87492850197fa96825c3ac5c5ded493f2540da"/>
+    <w:bookmarkEnd w:id="58"/>
+    <w:bookmarkEnd w:id="59"/>
+    <w:bookmarkStart w:id="63" w:name="Xc87492850197fa96825c3ac5c5ded493f2540da"/>
     <w:p>
       <w:pPr>
         <w:pStyle w:val="Heading2"/>
@@ -4033,7 +4135,7 @@
         <w:t xml:space="preserve">Étape 12 — Synthèse obligatoire : « Ma chaîne de release est-elle production-ready ? »</w:t>
       </w:r>
     </w:p>
-    <w:bookmarkStart w:id="58" w:name="X34e60f19d0a21048df329588d062f86b6b54842"/>
+    <w:bookmarkStart w:id="60" w:name="X34e60f19d0a21048df329588d062f86b6b54842"/>
     <w:p>
       <w:pPr>
         <w:pStyle w:val="Heading3"/>
@@ -4054,8 +4156,8 @@
         <w:t xml:space="preserve">[Insérer vos commentaires pour chaque ligne du tableau de paradigmes.]</w:t>
       </w:r>
     </w:p>
-    <w:bookmarkEnd w:id="58"/>
-    <w:bookmarkStart w:id="59" w:name="Xb80e85dc3159bec82c3ba27134d88bdaf3f1424"/>
+    <w:bookmarkEnd w:id="60"/>
+    <w:bookmarkStart w:id="61" w:name="Xb80e85dc3159bec82c3ba27134d88bdaf3f1424"/>
     <w:p>
       <w:pPr>
         <w:pStyle w:val="Heading3"/>
@@ -4076,8 +4178,8 @@
         <w:t xml:space="preserve">[Analyse des 7 thèmes d’angles morts (Traçabilité distribuée, Loki, RUM, Chaos, Kyverno, Cosign, Velero) en 5 à 10 lignes par thème.]</w:t>
       </w:r>
     </w:p>
-    <w:bookmarkEnd w:id="59"/>
-    <w:bookmarkStart w:id="60" w:name="livrable-3-votre-position-darchitecte"/>
+    <w:bookmarkEnd w:id="61"/>
+    <w:bookmarkStart w:id="62" w:name="livrable-3-votre-position-darchitecte"/>
     <w:p>
       <w:pPr>
         <w:pStyle w:val="Heading3"/>
@@ -4098,9 +4200,9 @@
         <w:t xml:space="preserve">[Votre plaidoyer technique de 10 lignes maximum présentant les briques que vous conservez, remplacez ou ajoutez dans une architecture industrielle.]</w:t>
       </w:r>
     </w:p>
-    <w:bookmarkEnd w:id="60"/>
-    <w:bookmarkEnd w:id="61"/>
     <w:bookmarkEnd w:id="62"/>
+    <w:bookmarkEnd w:id="63"/>
+    <w:bookmarkEnd w:id="64"/>
     <w:sectPr>
       <w:footnotePr>
         <w:numRestart w:val="eachSect"/>

</xml_diff>

<commit_message>
docs: add annuaire dashboard JSON and finalize Etape 4 queries in report
</commit_message>
<xml_diff>
--- a/pulse-campus/RAPPORT.docx
+++ b/pulse-campus/RAPPORT.docx
@@ -2,7 +2,7 @@
 <file path=word/document.xml><?xml version="1.0" encoding="utf-8"?>
 <w:document xmlns:w="http://schemas.openxmlformats.org/wordprocessingml/2006/main" xmlns:m="http://schemas.openxmlformats.org/officeDocument/2006/math" xmlns:r="http://schemas.openxmlformats.org/officeDocument/2006/relationships" xmlns:o="urn:schemas-microsoft-com:office:office" xmlns:v="urn:schemas-microsoft-com:vml" xmlns:w10="urn:schemas-microsoft-com:office:word" xmlns:a="http://schemas.openxmlformats.org/drawingml/2006/main" xmlns:pic="http://schemas.openxmlformats.org/drawingml/2006/picture" xmlns:wp="http://schemas.openxmlformats.org/drawingml/2006/wordprocessingDrawing">
   <w:body>
-    <w:bookmarkStart w:id="64" w:name="Xb085d4ceeae88009f4c3cbd205ab9ae93c8917e"/>
+    <w:bookmarkStart w:id="66" w:name="Xb085d4ceeae88009f4c3cbd205ab9ae93c8917e"/>
     <w:p>
       <w:pPr>
         <w:pStyle w:val="Heading1"/>
@@ -2156,7 +2156,7 @@
     </w:p>
     <w:bookmarkEnd w:id="30"/>
     <w:bookmarkEnd w:id="31"/>
-    <w:bookmarkStart w:id="34" w:name="X652afbafe8673b02b7d127b85d3f179c5b7de32"/>
+    <w:bookmarkStart w:id="36" w:name="X652afbafe8673b02b7d127b85d3f179c5b7de32"/>
     <w:p>
       <w:pPr>
         <w:pStyle w:val="Heading2"/>
@@ -2165,7 +2165,7 @@
         <w:t xml:space="preserve">Étape 4 — Brancher votre service : ServiceMonitor + premier dashboard</w:t>
       </w:r>
     </w:p>
-    <w:bookmarkStart w:id="32" w:name="fichiers-de-configuration"/>
+    <w:bookmarkStart w:id="34" w:name="fichiers-de-configuration"/>
     <w:p>
       <w:pPr>
         <w:pStyle w:val="Heading3"/>
@@ -2187,7 +2187,7 @@
           <w:b/>
           <w:bCs/>
         </w:rPr>
-        <w:t xml:space="preserve">Lien vers le template ServiceMonitor du service</w:t>
+        <w:t xml:space="preserve">Template ServiceMonitor du service</w:t>
       </w:r>
       <w:r>
         <w:t xml:space="preserve"> </w:t>
@@ -2198,12 +2198,14 @@
       <w:r>
         <w:t xml:space="preserve"> </w:t>
       </w:r>
-      <w:r>
-        <w:rPr>
-          <w:rStyle w:val="VerbatimChar"/>
-        </w:rPr>
-        <w:t xml:space="preserve">templates/servicemonitor.yaml</w:t>
-      </w:r>
+      <w:hyperlink r:id="rId32">
+        <w:r>
+          <w:rPr>
+            <w:rStyle w:val="Hyperlink"/>
+          </w:rPr>
+          <w:t xml:space="preserve">servicemonitor.yaml</w:t>
+        </w:r>
+      </w:hyperlink>
     </w:p>
     <w:p>
       <w:pPr>
@@ -2218,7 +2220,7 @@
           <w:b/>
           <w:bCs/>
         </w:rPr>
-        <w:t xml:space="preserve">Lien vers le JSON du dashboard Grafana</w:t>
+        <w:t xml:space="preserve">JSON du dashboard Grafana</w:t>
       </w:r>
       <w:r>
         <w:t xml:space="preserve"> </w:t>
@@ -2229,15 +2231,17 @@
       <w:r>
         <w:t xml:space="preserve"> </w:t>
       </w:r>
-      <w:r>
-        <w:rPr>
-          <w:rStyle w:val="VerbatimChar"/>
-        </w:rPr>
-        <w:t xml:space="preserve">platform-sre/dashboards/[service].json</w:t>
-      </w:r>
-    </w:p>
-    <w:bookmarkEnd w:id="32"/>
-    <w:bookmarkStart w:id="33" w:name="X05fcd00c239621556cabf2e4d9d2e030d6dee12"/>
+      <w:hyperlink r:id="rId33">
+        <w:r>
+          <w:rPr>
+            <w:rStyle w:val="Hyperlink"/>
+          </w:rPr>
+          <w:t xml:space="preserve">annuaire.json</w:t>
+        </w:r>
+      </w:hyperlink>
+    </w:p>
+    <w:bookmarkEnd w:id="34"/>
+    <w:bookmarkStart w:id="35" w:name="X05fcd00c239621556cabf2e4d9d2e030d6dee12"/>
     <w:p>
       <w:pPr>
         <w:pStyle w:val="Heading3"/>
@@ -2274,7 +2278,17 @@
         <w:rPr>
           <w:rStyle w:val="VerbatimChar"/>
         </w:rPr>
-        <w:t xml:space="preserve">[Requête PromQL]</w:t>
+        <w:t xml:space="preserve">sum(rate(http_requests_total{job="annuaire-dev-annuaire"}[5m])) by (route, method)</w:t>
+      </w:r>
+      <w:r>
+        <w:br/>
+      </w:r>
+      <w:r>
+        <w:rPr>
+          <w:i/>
+          <w:iCs/>
+        </w:rPr>
+        <w:t xml:space="preserve">Explication : Calcule le taux de requêtes par seconde servies par l’annuaire, regroupées par route et méthode HTTP.</w:t>
       </w:r>
     </w:p>
     <w:p>
@@ -2305,7 +2319,17 @@
         <w:rPr>
           <w:rStyle w:val="VerbatimChar"/>
         </w:rPr>
-        <w:t xml:space="preserve">[Requête PromQL]</w:t>
+        <w:t xml:space="preserve">sum(rate(http_requests_total{job="annuaire-dev-annuaire", status_class="5xx"}[5m])) / sum(rate(http_requests_total{job="annuaire-dev-annuaire"}[5m]))</w:t>
+      </w:r>
+      <w:r>
+        <w:br/>
+      </w:r>
+      <w:r>
+        <w:rPr>
+          <w:i/>
+          <w:iCs/>
+        </w:rPr>
+        <w:t xml:space="preserve">Explication : Calcule la proportion de réponses en erreur HTTP 5xx par rapport au total des requêtes.</w:t>
       </w:r>
     </w:p>
     <w:p>
@@ -2329,14 +2353,108 @@
       <w:r>
         <w:t xml:space="preserve">:</w:t>
       </w:r>
+    </w:p>
+    <w:p>
+      <w:pPr>
+        <w:pStyle w:val="Compact"/>
+        <w:numPr>
+          <w:ilvl w:val="1"/>
+          <w:numId w:val="1004"/>
+        </w:numPr>
+      </w:pPr>
+      <w:r>
+        <w:rPr>
+          <w:b/>
+          <w:bCs/>
+        </w:rPr>
+        <w:t xml:space="preserve">p50 (médiane)</w:t>
+      </w:r>
+      <w:r>
+        <w:t xml:space="preserve"> </w:t>
+      </w:r>
+      <w:r>
+        <w:t xml:space="preserve">:</w:t>
+      </w:r>
+      <w:r>
+        <w:t xml:space="preserve"> </w:t>
+      </w:r>
+      <w:r>
+        <w:rPr>
+          <w:rStyle w:val="VerbatimChar"/>
+        </w:rPr>
+        <w:t xml:space="preserve">histogram_quantile(0.50, sum(rate(http_request_duration_seconds_bucket{job="annuaire-dev-annuaire"}[5m])) by (le))</w:t>
+      </w:r>
+    </w:p>
+    <w:p>
+      <w:pPr>
+        <w:pStyle w:val="Compact"/>
+        <w:numPr>
+          <w:ilvl w:val="1"/>
+          <w:numId w:val="1004"/>
+        </w:numPr>
+      </w:pPr>
+      <w:r>
+        <w:rPr>
+          <w:b/>
+          <w:bCs/>
+        </w:rPr>
+        <w:t xml:space="preserve">p95</w:t>
+      </w:r>
+      <w:r>
+        <w:t xml:space="preserve"> </w:t>
+      </w:r>
+      <w:r>
+        <w:t xml:space="preserve">:</w:t>
+      </w:r>
+      <w:r>
+        <w:t xml:space="preserve"> </w:t>
+      </w:r>
+      <w:r>
+        <w:rPr>
+          <w:rStyle w:val="VerbatimChar"/>
+        </w:rPr>
+        <w:t xml:space="preserve">histogram_quantile(0.95, sum(rate(http_request_duration_seconds_bucket{job="annuaire-dev-annuaire"}[5m])) by (le))</w:t>
+      </w:r>
+    </w:p>
+    <w:p>
+      <w:pPr>
+        <w:pStyle w:val="Compact"/>
+        <w:numPr>
+          <w:ilvl w:val="1"/>
+          <w:numId w:val="1004"/>
+        </w:numPr>
+      </w:pPr>
+      <w:r>
+        <w:rPr>
+          <w:b/>
+          <w:bCs/>
+        </w:rPr>
+        <w:t xml:space="preserve">p99</w:t>
+      </w:r>
+      <w:r>
+        <w:t xml:space="preserve"> </w:t>
+      </w:r>
+      <w:r>
+        <w:t xml:space="preserve">:</w:t>
+      </w:r>
+      <w:r>
+        <w:t xml:space="preserve"> </w:t>
+      </w:r>
+      <w:r>
+        <w:rPr>
+          <w:rStyle w:val="VerbatimChar"/>
+        </w:rPr>
+        <w:t xml:space="preserve">histogram_quantile(0.99, sum(rate(http_request_duration_seconds_bucket{job="annuaire-dev-annuaire"}[5m])) by (le))</w:t>
+      </w:r>
       <w:r>
         <w:br/>
       </w:r>
       <w:r>
         <w:rPr>
-          <w:rStyle w:val="VerbatimChar"/>
-        </w:rPr>
-        <w:t xml:space="preserve">[Requête PromQL]</w:t>
+          <w:i/>
+          <w:iCs/>
+        </w:rPr>
+        <w:t xml:space="preserve">Explication : Calcule les quantiles de latence des requêtes HTTP à partir des buckets d’histogrammes configurés.</w:t>
       </w:r>
     </w:p>
     <w:p>
@@ -2352,7 +2470,7 @@
           <w:b/>
           <w:bCs/>
         </w:rPr>
-        <w:t xml:space="preserve">Build info</w:t>
+        <w:t xml:space="preserve">Build info (active image tag)</w:t>
       </w:r>
       <w:r>
         <w:t xml:space="preserve"> </w:t>
@@ -2367,7 +2485,17 @@
         <w:rPr>
           <w:rStyle w:val="VerbatimChar"/>
         </w:rPr>
-        <w:t xml:space="preserve">[Requête PromQL]</w:t>
+        <w:t xml:space="preserve">sum(annuaire_build_info) by (version, commit, language)</w:t>
+      </w:r>
+      <w:r>
+        <w:br/>
+      </w:r>
+      <w:r>
+        <w:rPr>
+          <w:i/>
+          <w:iCs/>
+        </w:rPr>
+        <w:t xml:space="preserve">Explication : Extrait les métadonnées de version applicative exposées par la jauge statique du middleware.</w:t>
       </w:r>
     </w:p>
     <w:p>
@@ -2377,9 +2505,9 @@
         </w:pict>
       </w:r>
     </w:p>
-    <w:bookmarkEnd w:id="33"/>
-    <w:bookmarkEnd w:id="34"/>
-    <w:bookmarkStart w:id="37" w:name="étape-5-du-deployment-au-rollout"/>
+    <w:bookmarkEnd w:id="35"/>
+    <w:bookmarkEnd w:id="36"/>
+    <w:bookmarkStart w:id="39" w:name="étape-5-du-deployment-au-rollout"/>
     <w:p>
       <w:pPr>
         <w:pStyle w:val="Heading2"/>
@@ -2388,162 +2516,13 @@
         <w:t xml:space="preserve">Étape 5 — Du Deployment au Rollout</w:t>
       </w:r>
     </w:p>
-    <w:bookmarkStart w:id="35" w:name="fichiers-de-configuration-1"/>
+    <w:bookmarkStart w:id="37" w:name="fichiers-de-configuration-1"/>
     <w:p>
       <w:pPr>
         <w:pStyle w:val="Heading3"/>
       </w:pPr>
       <w:r>
         <w:t xml:space="preserve">1. Fichiers de configuration</w:t>
-      </w:r>
-    </w:p>
-    <w:p>
-      <w:pPr>
-        <w:pStyle w:val="Compact"/>
-        <w:numPr>
-          <w:ilvl w:val="0"/>
-          <w:numId w:val="1004"/>
-        </w:numPr>
-      </w:pPr>
-      <w:r>
-        <w:rPr>
-          <w:b/>
-          <w:bCs/>
-        </w:rPr>
-        <w:t xml:space="preserve">Lien vers l’Application d’installation d’Argo Rollouts</w:t>
-      </w:r>
-      <w:r>
-        <w:t xml:space="preserve"> </w:t>
-      </w:r>
-      <w:r>
-        <w:t xml:space="preserve">:</w:t>
-      </w:r>
-      <w:r>
-        <w:t xml:space="preserve"> </w:t>
-      </w:r>
-      <w:r>
-        <w:rPr>
-          <w:rStyle w:val="VerbatimChar"/>
-        </w:rPr>
-        <w:t xml:space="preserve">platform-sre/apps/argo-rollouts.yaml</w:t>
-      </w:r>
-    </w:p>
-    <w:p>
-      <w:pPr>
-        <w:pStyle w:val="Compact"/>
-        <w:numPr>
-          <w:ilvl w:val="0"/>
-          <w:numId w:val="1004"/>
-        </w:numPr>
-      </w:pPr>
-      <w:r>
-        <w:rPr>
-          <w:b/>
-          <w:bCs/>
-        </w:rPr>
-        <w:t xml:space="preserve">Lien vers le chart mis à jour (Rollout + Services)</w:t>
-      </w:r>
-      <w:r>
-        <w:t xml:space="preserve"> </w:t>
-      </w:r>
-      <w:r>
-        <w:t xml:space="preserve">:</w:t>
-      </w:r>
-      <w:r>
-        <w:t xml:space="preserve"> </w:t>
-      </w:r>
-      <w:r>
-        <w:rPr>
-          <w:rStyle w:val="VerbatimChar"/>
-        </w:rPr>
-        <w:t xml:space="preserve">templates/rollout.yaml</w:t>
-      </w:r>
-    </w:p>
-    <w:bookmarkEnd w:id="35"/>
-    <w:bookmarkStart w:id="36" w:name="capture-du-canary-en-cours"/>
-    <w:p>
-      <w:pPr>
-        <w:pStyle w:val="Heading3"/>
-      </w:pPr>
-      <w:r>
-        <w:t xml:space="preserve">2. Capture du Canary en cours</w:t>
-      </w:r>
-    </w:p>
-    <w:p>
-      <w:pPr>
-        <w:pStyle w:val="FirstParagraph"/>
-      </w:pPr>
-      <w:r>
-        <w:rPr>
-          <w:i/>
-          <w:iCs/>
-        </w:rPr>
-        <w:t xml:space="preserve">[Insérer la capture d’écran de la commande</w:t>
-      </w:r>
-      <w:r>
-        <w:rPr>
-          <w:i/>
-          <w:iCs/>
-        </w:rPr>
-        <w:t xml:space="preserve"> </w:t>
-      </w:r>
-      <w:r>
-        <w:rPr>
-          <w:rStyle w:val="VerbatimChar"/>
-          <w:i/>
-          <w:iCs/>
-        </w:rPr>
-        <w:t xml:space="preserve">kubectl argo rollouts get rollout</w:t>
-      </w:r>
-      <w:r>
-        <w:rPr>
-          <w:i/>
-          <w:iCs/>
-        </w:rPr>
-        <w:t xml:space="preserve"> </w:t>
-      </w:r>
-      <w:r>
-        <w:rPr>
-          <w:i/>
-          <w:iCs/>
-        </w:rPr>
-        <w:t xml:space="preserve">montrant le split de trafic (ex: 20% / 80%).]</w:t>
-      </w:r>
-    </w:p>
-    <w:p>
-      <w:r>
-        <w:pict>
-          <v:rect style="width:0;height:1.5pt" o:hralign="center" o:hrstd="t" o:hr="t"/>
-        </w:pict>
-      </w:r>
-    </w:p>
-    <w:bookmarkEnd w:id="36"/>
-    <w:bookmarkEnd w:id="37"/>
-    <w:bookmarkStart w:id="43" w:name="Xc7a5a4a1669bf27094346f7cb9f7a61bc483680"/>
-    <w:p>
-      <w:pPr>
-        <w:pStyle w:val="Heading2"/>
-      </w:pPr>
-      <w:r>
-        <w:t xml:space="preserve">Étape 6 — Canary manuel : pause, promote, abort</w:t>
-      </w:r>
-    </w:p>
-    <w:bookmarkStart w:id="41" w:name="X3dd8846d802fe5469b133df634ec839a619d22b"/>
-    <w:p>
-      <w:pPr>
-        <w:pStyle w:val="Heading3"/>
-      </w:pPr>
-      <w:r>
-        <w:t xml:space="preserve">1. Pilotage manuel : Les 3 scénarios documentés</w:t>
-      </w:r>
-    </w:p>
-    <w:bookmarkStart w:id="38" w:name="scénario-1-promotion-normale"/>
-    <w:p>
-      <w:pPr>
-        <w:pStyle w:val="Heading4"/>
-      </w:pPr>
-      <w:r>
-        <w:t xml:space="preserve">Scénario 1 : Promotion normale</w:t>
       </w:r>
     </w:p>
     <w:p>
@@ -2559,7 +2538,7 @@
           <w:b/>
           <w:bCs/>
         </w:rPr>
-        <w:t xml:space="preserve">Commande exacte</w:t>
+        <w:t xml:space="preserve">Lien vers l’Application d’installation d’Argo Rollouts</w:t>
       </w:r>
       <w:r>
         <w:t xml:space="preserve"> </w:t>
@@ -2574,7 +2553,7 @@
         <w:rPr>
           <w:rStyle w:val="VerbatimChar"/>
         </w:rPr>
-        <w:t xml:space="preserve">kubectl argo rollouts promote [nom]</w:t>
+        <w:t xml:space="preserve">platform-sre/apps/argo-rollouts.yaml</w:t>
       </w:r>
     </w:p>
     <w:p>
@@ -2587,26 +2566,112 @@
       </w:pPr>
       <w:r>
         <w:rPr>
+          <w:b/>
+          <w:bCs/>
+        </w:rPr>
+        <w:t xml:space="preserve">Lien vers le chart mis à jour (Rollout + Services)</w:t>
+      </w:r>
+      <w:r>
+        <w:t xml:space="preserve"> </w:t>
+      </w:r>
+      <w:r>
+        <w:t xml:space="preserve">:</w:t>
+      </w:r>
+      <w:r>
+        <w:t xml:space="preserve"> </w:t>
+      </w:r>
+      <w:r>
+        <w:rPr>
+          <w:rStyle w:val="VerbatimChar"/>
+        </w:rPr>
+        <w:t xml:space="preserve">templates/rollout.yaml</w:t>
+      </w:r>
+    </w:p>
+    <w:bookmarkEnd w:id="37"/>
+    <w:bookmarkStart w:id="38" w:name="capture-du-canary-en-cours"/>
+    <w:p>
+      <w:pPr>
+        <w:pStyle w:val="Heading3"/>
+      </w:pPr>
+      <w:r>
+        <w:t xml:space="preserve">2. Capture du Canary en cours</w:t>
+      </w:r>
+    </w:p>
+    <w:p>
+      <w:pPr>
+        <w:pStyle w:val="FirstParagraph"/>
+      </w:pPr>
+      <w:r>
+        <w:rPr>
           <w:i/>
           <w:iCs/>
         </w:rPr>
-        <w:t xml:space="preserve">Observations et captures</w:t>
-      </w:r>
-      <w:r>
-        <w:t xml:space="preserve"> </w:t>
-      </w:r>
-      <w:r>
-        <w:t xml:space="preserve">: [Détails]</w:t>
+        <w:t xml:space="preserve">[Insérer la capture d’écran de la commande</w:t>
+      </w:r>
+      <w:r>
+        <w:rPr>
+          <w:i/>
+          <w:iCs/>
+        </w:rPr>
+        <w:t xml:space="preserve"> </w:t>
+      </w:r>
+      <w:r>
+        <w:rPr>
+          <w:rStyle w:val="VerbatimChar"/>
+          <w:i/>
+          <w:iCs/>
+        </w:rPr>
+        <w:t xml:space="preserve">kubectl argo rollouts get rollout</w:t>
+      </w:r>
+      <w:r>
+        <w:rPr>
+          <w:i/>
+          <w:iCs/>
+        </w:rPr>
+        <w:t xml:space="preserve"> </w:t>
+      </w:r>
+      <w:r>
+        <w:rPr>
+          <w:i/>
+          <w:iCs/>
+        </w:rPr>
+        <w:t xml:space="preserve">montrant le split de trafic (ex: 20% / 80%).]</w:t>
+      </w:r>
+    </w:p>
+    <w:p>
+      <w:r>
+        <w:pict>
+          <v:rect style="width:0;height:1.5pt" o:hralign="center" o:hrstd="t" o:hr="t"/>
+        </w:pict>
       </w:r>
     </w:p>
     <w:bookmarkEnd w:id="38"/>
-    <w:bookmarkStart w:id="39" w:name="scénario-2-annulation-explicite-abort"/>
+    <w:bookmarkEnd w:id="39"/>
+    <w:bookmarkStart w:id="45" w:name="Xc7a5a4a1669bf27094346f7cb9f7a61bc483680"/>
+    <w:p>
+      <w:pPr>
+        <w:pStyle w:val="Heading2"/>
+      </w:pPr>
+      <w:r>
+        <w:t xml:space="preserve">Étape 6 — Canary manuel : pause, promote, abort</w:t>
+      </w:r>
+    </w:p>
+    <w:bookmarkStart w:id="43" w:name="X3dd8846d802fe5469b133df634ec839a619d22b"/>
+    <w:p>
+      <w:pPr>
+        <w:pStyle w:val="Heading3"/>
+      </w:pPr>
+      <w:r>
+        <w:t xml:space="preserve">1. Pilotage manuel : Les 3 scénarios documentés</w:t>
+      </w:r>
+    </w:p>
+    <w:bookmarkStart w:id="40" w:name="scénario-1-promotion-normale"/>
     <w:p>
       <w:pPr>
         <w:pStyle w:val="Heading4"/>
       </w:pPr>
       <w:r>
-        <w:t xml:space="preserve">Scénario 2 : Annulation explicite (Abort)</w:t>
+        <w:t xml:space="preserve">Scénario 1 : Promotion normale</w:t>
       </w:r>
     </w:p>
     <w:p>
@@ -2637,7 +2702,7 @@
         <w:rPr>
           <w:rStyle w:val="VerbatimChar"/>
         </w:rPr>
-        <w:t xml:space="preserve">kubectl argo rollouts abort [nom]</w:t>
+        <w:t xml:space="preserve">kubectl argo rollouts promote [nom]</w:t>
       </w:r>
     </w:p>
     <w:p>
@@ -2662,14 +2727,14 @@
         <w:t xml:space="preserve">: [Détails]</w:t>
       </w:r>
     </w:p>
-    <w:bookmarkEnd w:id="39"/>
-    <w:bookmarkStart w:id="40" w:name="scénario-3-promotion-forcée-full"/>
+    <w:bookmarkEnd w:id="40"/>
+    <w:bookmarkStart w:id="41" w:name="scénario-2-annulation-explicite-abort"/>
     <w:p>
       <w:pPr>
         <w:pStyle w:val="Heading4"/>
       </w:pPr>
       <w:r>
-        <w:t xml:space="preserve">Scénario 3 : Promotion forcée (Full)</w:t>
+        <w:t xml:space="preserve">Scénario 2 : Annulation explicite (Abort)</w:t>
       </w:r>
     </w:p>
     <w:p>
@@ -2700,7 +2765,7 @@
         <w:rPr>
           <w:rStyle w:val="VerbatimChar"/>
         </w:rPr>
-        <w:t xml:space="preserve">kubectl argo rollouts promote [nom] --full</w:t>
+        <w:t xml:space="preserve">kubectl argo rollouts abort [nom]</w:t>
       </w:r>
     </w:p>
     <w:p>
@@ -2725,65 +2790,14 @@
         <w:t xml:space="preserve">: [Détails]</w:t>
       </w:r>
     </w:p>
-    <w:bookmarkEnd w:id="40"/>
     <w:bookmarkEnd w:id="41"/>
-    <w:bookmarkStart w:id="42" w:name="X7dbcb4f0d6eab82b24b1c934735d50db3993efb"/>
-    <w:p>
-      <w:pPr>
-        <w:pStyle w:val="Heading3"/>
-      </w:pPr>
-      <w:r>
-        <w:t xml:space="preserve">2. Réponse argumentée : Promote</w:t>
-      </w:r>
-      <w:r>
-        <w:t xml:space="preserve"> </w:t>
-      </w:r>
-      <w:r>
-        <w:rPr>
-          <w:rStyle w:val="VerbatimChar"/>
-        </w:rPr>
-        <w:t xml:space="preserve">--full</w:t>
-      </w:r>
-      <w:r>
-        <w:t xml:space="preserve"> </w:t>
-      </w:r>
-      <w:r>
-        <w:t xml:space="preserve">en production</w:t>
-      </w:r>
-    </w:p>
-    <w:p>
-      <w:pPr>
-        <w:pStyle w:val="BlockText"/>
-      </w:pPr>
-      <w:r>
-        <w:t xml:space="preserve">« [Insérer votre réponse argumentée sur le danger et la justification du promote –full en production] »</w:t>
-      </w:r>
-    </w:p>
-    <w:p>
-      <w:r>
-        <w:pict>
-          <v:rect style="width:0;height:1.5pt" o:hralign="center" o:hrstd="t" o:hr="t"/>
-        </w:pict>
-      </w:r>
-    </w:p>
-    <w:bookmarkEnd w:id="42"/>
-    <w:bookmarkEnd w:id="43"/>
-    <w:bookmarkStart w:id="47" w:name="Xfa670e360291aaa624fb95e24517daba86d6754"/>
-    <w:p>
-      <w:pPr>
-        <w:pStyle w:val="Heading2"/>
-      </w:pPr>
-      <w:r>
-        <w:t xml:space="preserve">Étape 7 — AnalysisTemplate : La promotion sur preuve</w:t>
-      </w:r>
-    </w:p>
-    <w:bookmarkStart w:id="44" w:name="fichiers-de-configuration-2"/>
-    <w:p>
-      <w:pPr>
-        <w:pStyle w:val="Heading3"/>
-      </w:pPr>
-      <w:r>
-        <w:t xml:space="preserve">1. Fichiers de configuration</w:t>
+    <w:bookmarkStart w:id="42" w:name="scénario-3-promotion-forcée-full"/>
+    <w:p>
+      <w:pPr>
+        <w:pStyle w:val="Heading4"/>
+      </w:pPr>
+      <w:r>
+        <w:t xml:space="preserve">Scénario 3 : Promotion forcée (Full)</w:t>
       </w:r>
     </w:p>
     <w:p>
@@ -2799,7 +2813,7 @@
           <w:b/>
           <w:bCs/>
         </w:rPr>
-        <w:t xml:space="preserve">Lien vers l’AnalysisTemplate</w:t>
+        <w:t xml:space="preserve">Commande exacte</w:t>
       </w:r>
       <w:r>
         <w:t xml:space="preserve"> </w:t>
@@ -2814,17 +2828,90 @@
         <w:rPr>
           <w:rStyle w:val="VerbatimChar"/>
         </w:rPr>
-        <w:t xml:space="preserve">templates/analysistemplate.yaml</w:t>
+        <w:t xml:space="preserve">kubectl argo rollouts promote [nom] --full</w:t>
+      </w:r>
+    </w:p>
+    <w:p>
+      <w:pPr>
+        <w:pStyle w:val="Compact"/>
+        <w:numPr>
+          <w:ilvl w:val="0"/>
+          <w:numId w:val="1008"/>
+        </w:numPr>
+      </w:pPr>
+      <w:r>
+        <w:rPr>
+          <w:i/>
+          <w:iCs/>
+        </w:rPr>
+        <w:t xml:space="preserve">Observations et captures</w:t>
+      </w:r>
+      <w:r>
+        <w:t xml:space="preserve"> </w:t>
+      </w:r>
+      <w:r>
+        <w:t xml:space="preserve">: [Détails]</w:t>
+      </w:r>
+    </w:p>
+    <w:bookmarkEnd w:id="42"/>
+    <w:bookmarkEnd w:id="43"/>
+    <w:bookmarkStart w:id="44" w:name="X7dbcb4f0d6eab82b24b1c934735d50db3993efb"/>
+    <w:p>
+      <w:pPr>
+        <w:pStyle w:val="Heading3"/>
+      </w:pPr>
+      <w:r>
+        <w:t xml:space="preserve">2. Réponse argumentée : Promote</w:t>
+      </w:r>
+      <w:r>
+        <w:t xml:space="preserve"> </w:t>
+      </w:r>
+      <w:r>
+        <w:rPr>
+          <w:rStyle w:val="VerbatimChar"/>
+        </w:rPr>
+        <w:t xml:space="preserve">--full</w:t>
+      </w:r>
+      <w:r>
+        <w:t xml:space="preserve"> </w:t>
+      </w:r>
+      <w:r>
+        <w:t xml:space="preserve">en production</w:t>
+      </w:r>
+    </w:p>
+    <w:p>
+      <w:pPr>
+        <w:pStyle w:val="BlockText"/>
+      </w:pPr>
+      <w:r>
+        <w:t xml:space="preserve">« [Insérer votre réponse argumentée sur le danger et la justification du promote –full en production] »</w:t>
+      </w:r>
+    </w:p>
+    <w:p>
+      <w:r>
+        <w:pict>
+          <v:rect style="width:0;height:1.5pt" o:hralign="center" o:hrstd="t" o:hr="t"/>
+        </w:pict>
       </w:r>
     </w:p>
     <w:bookmarkEnd w:id="44"/>
-    <w:bookmarkStart w:id="45" w:name="captures-décrans-des-analysisruns"/>
+    <w:bookmarkEnd w:id="45"/>
+    <w:bookmarkStart w:id="49" w:name="Xfa670e360291aaa624fb95e24517daba86d6754"/>
+    <w:p>
+      <w:pPr>
+        <w:pStyle w:val="Heading2"/>
+      </w:pPr>
+      <w:r>
+        <w:t xml:space="preserve">Étape 7 — AnalysisTemplate : La promotion sur preuve</w:t>
+      </w:r>
+    </w:p>
+    <w:bookmarkStart w:id="46" w:name="fichiers-de-configuration-2"/>
     <w:p>
       <w:pPr>
         <w:pStyle w:val="Heading3"/>
       </w:pPr>
       <w:r>
-        <w:t xml:space="preserve">2. Captures d’écrans des AnalysisRuns</w:t>
+        <w:t xml:space="preserve">1. Fichiers de configuration</w:t>
       </w:r>
     </w:p>
     <w:p>
@@ -2840,104 +2927,32 @@
           <w:b/>
           <w:bCs/>
         </w:rPr>
-        <w:t xml:space="preserve">AnalysisRun réussi</w:t>
-      </w:r>
-      <w:r>
-        <w:t xml:space="preserve"> </w:t>
-      </w:r>
-      <w:r>
-        <w:t xml:space="preserve">(Canary OK, promotion automatique) :</w:t>
-      </w:r>
-      <w:r>
-        <w:t xml:space="preserve"> </w:t>
-      </w:r>
-      <w:r>
-        <w:rPr>
-          <w:i/>
-          <w:iCs/>
-        </w:rPr>
-        <w:t xml:space="preserve">[Insérer la capture]</w:t>
-      </w:r>
-    </w:p>
-    <w:p>
-      <w:pPr>
-        <w:pStyle w:val="Compact"/>
-        <w:numPr>
-          <w:ilvl w:val="0"/>
-          <w:numId w:val="1009"/>
-        </w:numPr>
-      </w:pPr>
-      <w:r>
-        <w:rPr>
-          <w:b/>
-          <w:bCs/>
-        </w:rPr>
-        <w:t xml:space="preserve">AnalysisRun échoué</w:t>
-      </w:r>
-      <w:r>
-        <w:t xml:space="preserve"> </w:t>
-      </w:r>
-      <w:r>
-        <w:t xml:space="preserve">(Canary KO, rollback automatique) :</w:t>
-      </w:r>
-      <w:r>
-        <w:t xml:space="preserve"> </w:t>
-      </w:r>
-      <w:r>
-        <w:rPr>
-          <w:i/>
-          <w:iCs/>
-        </w:rPr>
-        <w:t xml:space="preserve">[Insérer la capture]</w:t>
-      </w:r>
-    </w:p>
-    <w:bookmarkEnd w:id="45"/>
-    <w:bookmarkStart w:id="46" w:name="X2e7d2881f7b039fea1d377948030bdade82a569"/>
+        <w:t xml:space="preserve">Lien vers l’AnalysisTemplate</w:t>
+      </w:r>
+      <w:r>
+        <w:t xml:space="preserve"> </w:t>
+      </w:r>
+      <w:r>
+        <w:t xml:space="preserve">:</w:t>
+      </w:r>
+      <w:r>
+        <w:t xml:space="preserve"> </w:t>
+      </w:r>
+      <w:r>
+        <w:rPr>
+          <w:rStyle w:val="VerbatimChar"/>
+        </w:rPr>
+        <w:t xml:space="preserve">templates/analysistemplate.yaml</w:t>
+      </w:r>
+    </w:p>
+    <w:bookmarkEnd w:id="46"/>
+    <w:bookmarkStart w:id="47" w:name="captures-décrans-des-analysisruns"/>
     <w:p>
       <w:pPr>
         <w:pStyle w:val="Heading3"/>
       </w:pPr>
       <w:r>
-        <w:t xml:space="preserve">3. Discussion sur le choix des seuils et la durée d’analyse</w:t>
-      </w:r>
-    </w:p>
-    <w:p>
-      <w:pPr>
-        <w:pStyle w:val="FirstParagraph"/>
-      </w:pPr>
-      <w:r>
-        <w:rPr>
-          <w:i/>
-          <w:iCs/>
-        </w:rPr>
-        <w:t xml:space="preserve">[Remplir votre discussion sur le calibrage des seuils (taux d’erreur &lt; 1%, latence) et la durée (5 minutes) pour obtenir une mesure statistiquement viable.]</w:t>
-      </w:r>
-    </w:p>
-    <w:p>
-      <w:r>
-        <w:pict>
-          <v:rect style="width:0;height:1.5pt" o:hralign="center" o:hrstd="t" o:hr="t"/>
-        </w:pict>
-      </w:r>
-    </w:p>
-    <w:bookmarkEnd w:id="46"/>
-    <w:bookmarkEnd w:id="47"/>
-    <w:bookmarkStart w:id="51" w:name="X650888a7878ecfd10f02440625a24c231940db3"/>
-    <w:p>
-      <w:pPr>
-        <w:pStyle w:val="Heading2"/>
-      </w:pPr>
-      <w:r>
-        <w:t xml:space="preserve">Étape 8 — Blue/Green : Autre stratégie, autre arbitrage</w:t>
-      </w:r>
-    </w:p>
-    <w:bookmarkStart w:id="48" w:name="fichiers-de-configuration-3"/>
-    <w:p>
-      <w:pPr>
-        <w:pStyle w:val="Heading3"/>
-      </w:pPr>
-      <w:r>
-        <w:t xml:space="preserve">1. Fichiers de configuration</w:t>
+        <w:t xml:space="preserve">2. Captures d’écrans des AnalysisRuns</w:t>
       </w:r>
     </w:p>
     <w:p>
@@ -2953,66 +2968,77 @@
           <w:b/>
           <w:bCs/>
         </w:rPr>
-        <w:t xml:space="preserve">Lien vers le chart Helm du service configuré en Blue/Green</w:t>
-      </w:r>
-      <w:r>
-        <w:t xml:space="preserve"> </w:t>
-      </w:r>
-      <w:r>
-        <w:t xml:space="preserve">:</w:t>
-      </w:r>
-      <w:r>
-        <w:t xml:space="preserve"> </w:t>
-      </w:r>
-      <w:r>
-        <w:rPr>
-          <w:rStyle w:val="VerbatimChar"/>
-        </w:rPr>
-        <w:t xml:space="preserve">templates/rollout.yaml</w:t>
-      </w:r>
-    </w:p>
-    <w:bookmarkEnd w:id="48"/>
-    <w:bookmarkStart w:id="49" w:name="tableau-comparatif-canary-vs.-bluegreen"/>
-    <w:p>
-      <w:pPr>
-        <w:pStyle w:val="Heading3"/>
-      </w:pPr>
-      <w:r>
-        <w:t xml:space="preserve">2. Tableau comparatif : Canary vs. Blue/Green</w:t>
-      </w:r>
-    </w:p>
-    <w:p>
-      <w:pPr>
-        <w:pStyle w:val="FirstParagraph"/>
-      </w:pPr>
+        <w:t xml:space="preserve">AnalysisRun réussi</w:t>
+      </w:r>
+      <w:r>
+        <w:t xml:space="preserve"> </w:t>
+      </w:r>
+      <w:r>
+        <w:t xml:space="preserve">(Canary OK, promotion automatique) :</w:t>
+      </w:r>
+      <w:r>
+        <w:t xml:space="preserve"> </w:t>
+      </w:r>
       <w:r>
         <w:rPr>
           <w:i/>
           <w:iCs/>
         </w:rPr>
-        <w:t xml:space="preserve">[Insérer votre tableau comparatif présentant les avantages, inconvénients et cas d’usages respectifs.]</w:t>
-      </w:r>
-    </w:p>
-    <w:bookmarkEnd w:id="49"/>
-    <w:bookmarkStart w:id="50" w:name="capture-de-la-bascule-manuelle-réussie"/>
-    <w:p>
-      <w:pPr>
-        <w:pStyle w:val="Heading3"/>
-      </w:pPr>
-      <w:r>
-        <w:t xml:space="preserve">3. Capture de la bascule manuelle réussie</w:t>
-      </w:r>
-    </w:p>
-    <w:p>
-      <w:pPr>
-        <w:pStyle w:val="FirstParagraph"/>
-      </w:pPr>
+        <w:t xml:space="preserve">[Insérer la capture]</w:t>
+      </w:r>
+    </w:p>
+    <w:p>
+      <w:pPr>
+        <w:pStyle w:val="Compact"/>
+        <w:numPr>
+          <w:ilvl w:val="0"/>
+          <w:numId w:val="1010"/>
+        </w:numPr>
+      </w:pPr>
+      <w:r>
+        <w:rPr>
+          <w:b/>
+          <w:bCs/>
+        </w:rPr>
+        <w:t xml:space="preserve">AnalysisRun échoué</w:t>
+      </w:r>
+      <w:r>
+        <w:t xml:space="preserve"> </w:t>
+      </w:r>
+      <w:r>
+        <w:t xml:space="preserve">(Canary KO, rollback automatique) :</w:t>
+      </w:r>
+      <w:r>
+        <w:t xml:space="preserve"> </w:t>
+      </w:r>
       <w:r>
         <w:rPr>
           <w:i/>
           <w:iCs/>
         </w:rPr>
-        <w:t xml:space="preserve">[Insérer la capture de l’UI Argo Rollouts ou de la console lors de la bascule.]</w:t>
+        <w:t xml:space="preserve">[Insérer la capture]</w:t>
+      </w:r>
+    </w:p>
+    <w:bookmarkEnd w:id="47"/>
+    <w:bookmarkStart w:id="48" w:name="X2e7d2881f7b039fea1d377948030bdade82a569"/>
+    <w:p>
+      <w:pPr>
+        <w:pStyle w:val="Heading3"/>
+      </w:pPr>
+      <w:r>
+        <w:t xml:space="preserve">3. Discussion sur le choix des seuils et la durée d’analyse</w:t>
+      </w:r>
+    </w:p>
+    <w:p>
+      <w:pPr>
+        <w:pStyle w:val="FirstParagraph"/>
+      </w:pPr>
+      <w:r>
+        <w:rPr>
+          <w:i/>
+          <w:iCs/>
+        </w:rPr>
+        <w:t xml:space="preserve">[Remplir votre discussion sur le calibrage des seuils (taux d’erreur &lt; 1%, latence) et la durée (5 minutes) pour obtenir une mesure statistiquement viable.]</w:t>
       </w:r>
     </w:p>
     <w:p>
@@ -3022,18 +3048,18 @@
         </w:pict>
       </w:r>
     </w:p>
-    <w:bookmarkEnd w:id="50"/>
-    <w:bookmarkEnd w:id="51"/>
-    <w:bookmarkStart w:id="54" w:name="Xd90a1630ead798ac2772b636ce240c5b913f93f"/>
+    <w:bookmarkEnd w:id="48"/>
+    <w:bookmarkEnd w:id="49"/>
+    <w:bookmarkStart w:id="53" w:name="X650888a7878ecfd10f02440625a24c231940db3"/>
     <w:p>
       <w:pPr>
         <w:pStyle w:val="Heading2"/>
       </w:pPr>
       <w:r>
-        <w:t xml:space="preserve">Étape 9 — Routage avancé : Header-based pour les tests internes</w:t>
-      </w:r>
-    </w:p>
-    <w:bookmarkStart w:id="52" w:name="fichiers-de-configuration-4"/>
+        <w:t xml:space="preserve">Étape 8 — Blue/Green : Autre stratégie, autre arbitrage</w:t>
+      </w:r>
+    </w:p>
+    <w:bookmarkStart w:id="50" w:name="fichiers-de-configuration-3"/>
     <w:p>
       <w:pPr>
         <w:pStyle w:val="Heading3"/>
@@ -3055,7 +3081,7 @@
           <w:b/>
           <w:bCs/>
         </w:rPr>
-        <w:t xml:space="preserve">Lien vers le chart ou ingress mis à jour</w:t>
+        <w:t xml:space="preserve">Lien vers le chart Helm du service configuré en Blue/Green</w:t>
       </w:r>
       <w:r>
         <w:t xml:space="preserve"> </w:t>
@@ -3070,58 +3096,51 @@
         <w:rPr>
           <w:rStyle w:val="VerbatimChar"/>
         </w:rPr>
-        <w:t xml:space="preserve">templates/ingress.yaml</w:t>
-      </w:r>
-    </w:p>
-    <w:bookmarkEnd w:id="52"/>
-    <w:bookmarkStart w:id="53" w:name="X2378407b785e7aa7079f26fe8abbcf7ac4b8d5c"/>
+        <w:t xml:space="preserve">templates/rollout.yaml</w:t>
+      </w:r>
+    </w:p>
+    <w:bookmarkEnd w:id="50"/>
+    <w:bookmarkStart w:id="51" w:name="tableau-comparatif-canary-vs.-bluegreen"/>
     <w:p>
       <w:pPr>
         <w:pStyle w:val="Heading3"/>
       </w:pPr>
       <w:r>
-        <w:t xml:space="preserve">2. Démonstration curl des deux comportements</w:t>
-      </w:r>
-    </w:p>
-    <w:p>
-      <w:pPr>
-        <w:pStyle w:val="SourceCode"/>
-      </w:pPr>
-      <w:r>
-        <w:rPr>
-          <w:rStyle w:val="VerbatimChar"/>
-        </w:rPr>
-        <w:t xml:space="preserve">$ curl [service].devhub.local</w:t>
-      </w:r>
-      <w:r>
-        <w:br/>
-      </w:r>
-      <w:r>
-        <w:rPr>
-          <w:rStyle w:val="VerbatimChar"/>
-        </w:rPr>
-        <w:t xml:space="preserve">[Réponse attendue : version stable]</w:t>
-      </w:r>
-      <w:r>
-        <w:br/>
-      </w:r>
-      <w:r>
-        <w:br/>
-      </w:r>
-      <w:r>
-        <w:rPr>
-          <w:rStyle w:val="VerbatimChar"/>
-        </w:rPr>
-        <w:t xml:space="preserve">$ curl -H "X-Beta-User: true" [service].devhub.local</w:t>
-      </w:r>
-      <w:r>
-        <w:br/>
-      </w:r>
-      <w:r>
-        <w:rPr>
-          <w:rStyle w:val="VerbatimChar"/>
-        </w:rPr>
-        <w:t xml:space="preserve">[Réponse attendue : version canary]</w:t>
+        <w:t xml:space="preserve">2. Tableau comparatif : Canary vs. Blue/Green</w:t>
+      </w:r>
+    </w:p>
+    <w:p>
+      <w:pPr>
+        <w:pStyle w:val="FirstParagraph"/>
+      </w:pPr>
+      <w:r>
+        <w:rPr>
+          <w:i/>
+          <w:iCs/>
+        </w:rPr>
+        <w:t xml:space="preserve">[Insérer votre tableau comparatif présentant les avantages, inconvénients et cas d’usages respectifs.]</w:t>
+      </w:r>
+    </w:p>
+    <w:bookmarkEnd w:id="51"/>
+    <w:bookmarkStart w:id="52" w:name="capture-de-la-bascule-manuelle-réussie"/>
+    <w:p>
+      <w:pPr>
+        <w:pStyle w:val="Heading3"/>
+      </w:pPr>
+      <w:r>
+        <w:t xml:space="preserve">3. Capture de la bascule manuelle réussie</w:t>
+      </w:r>
+    </w:p>
+    <w:p>
+      <w:pPr>
+        <w:pStyle w:val="FirstParagraph"/>
+      </w:pPr>
+      <w:r>
+        <w:rPr>
+          <w:i/>
+          <w:iCs/>
+        </w:rPr>
+        <w:t xml:space="preserve">[Insérer la capture de l’UI Argo Rollouts ou de la console lors de la bascule.]</w:t>
       </w:r>
     </w:p>
     <w:p>
@@ -3131,24 +3150,24 @@
         </w:pict>
       </w:r>
     </w:p>
+    <w:bookmarkEnd w:id="52"/>
     <w:bookmarkEnd w:id="53"/>
-    <w:bookmarkEnd w:id="54"/>
-    <w:bookmarkStart w:id="57" w:name="Xaa93b513a84bfd46879aafda0934d49925bde83"/>
+    <w:bookmarkStart w:id="56" w:name="Xd90a1630ead798ac2772b636ce240c5b913f93f"/>
     <w:p>
       <w:pPr>
         <w:pStyle w:val="Heading2"/>
       </w:pPr>
       <w:r>
-        <w:t xml:space="preserve">Étape 10 — Alerting Alertmanager et notifications Rollouts</w:t>
-      </w:r>
-    </w:p>
-    <w:bookmarkStart w:id="55" w:name="X30991d32a017905e182502f8ac1bf66caedec37"/>
+        <w:t xml:space="preserve">Étape 9 — Routage avancé : Header-based pour les tests internes</w:t>
+      </w:r>
+    </w:p>
+    <w:bookmarkStart w:id="54" w:name="fichiers-de-configuration-4"/>
     <w:p>
       <w:pPr>
         <w:pStyle w:val="Heading3"/>
       </w:pPr>
       <w:r>
-        <w:t xml:space="preserve">1. Fichiers et configurations de la chaîne d’alerte</w:t>
+        <w:t xml:space="preserve">1. Fichiers de configuration</w:t>
       </w:r>
     </w:p>
     <w:p>
@@ -3164,7 +3183,7 @@
           <w:b/>
           <w:bCs/>
         </w:rPr>
-        <w:t xml:space="preserve">Lien vers les PrometheusRules</w:t>
+        <w:t xml:space="preserve">Lien vers le chart ou ingress mis à jour</w:t>
       </w:r>
       <w:r>
         <w:t xml:space="preserve"> </w:t>
@@ -3179,79 +3198,85 @@
         <w:rPr>
           <w:rStyle w:val="VerbatimChar"/>
         </w:rPr>
-        <w:t xml:space="preserve">templates/prometheusrule.yaml</w:t>
-      </w:r>
-    </w:p>
-    <w:p>
-      <w:pPr>
-        <w:pStyle w:val="Compact"/>
-        <w:numPr>
-          <w:ilvl w:val="0"/>
-          <w:numId w:val="1012"/>
-        </w:numPr>
-      </w:pPr>
-      <w:r>
-        <w:rPr>
-          <w:b/>
-          <w:bCs/>
-        </w:rPr>
-        <w:t xml:space="preserve">Configuration d’Alertmanager</w:t>
-      </w:r>
-      <w:r>
-        <w:t xml:space="preserve"> </w:t>
-      </w:r>
-      <w:r>
-        <w:t xml:space="preserve">:</w:t>
-      </w:r>
-      <w:r>
-        <w:t xml:space="preserve"> </w:t>
-      </w:r>
-      <w:r>
-        <w:rPr>
-          <w:rStyle w:val="VerbatimChar"/>
-        </w:rPr>
-        <w:t xml:space="preserve">platform-sre/alertmanager-config.yaml</w:t>
-      </w:r>
-    </w:p>
-    <w:p>
-      <w:pPr>
-        <w:pStyle w:val="Compact"/>
-        <w:numPr>
-          <w:ilvl w:val="0"/>
-          <w:numId w:val="1012"/>
-        </w:numPr>
-      </w:pPr>
-      <w:r>
-        <w:rPr>
-          <w:b/>
-          <w:bCs/>
-        </w:rPr>
-        <w:t xml:space="preserve">Configuration des notifications d’Argo Rollouts</w:t>
-      </w:r>
-      <w:r>
-        <w:t xml:space="preserve"> </w:t>
-      </w:r>
-      <w:r>
-        <w:t xml:space="preserve">:</w:t>
-      </w:r>
-      <w:r>
-        <w:t xml:space="preserve"> </w:t>
-      </w:r>
-      <w:r>
-        <w:rPr>
-          <w:rStyle w:val="VerbatimChar"/>
-        </w:rPr>
-        <w:t xml:space="preserve">platform-sre/rollouts-notifications.yaml</w:t>
+        <w:t xml:space="preserve">templates/ingress.yaml</w:t>
+      </w:r>
+    </w:p>
+    <w:bookmarkEnd w:id="54"/>
+    <w:bookmarkStart w:id="55" w:name="X2378407b785e7aa7079f26fe8abbcf7ac4b8d5c"/>
+    <w:p>
+      <w:pPr>
+        <w:pStyle w:val="Heading3"/>
+      </w:pPr>
+      <w:r>
+        <w:t xml:space="preserve">2. Démonstration curl des deux comportements</w:t>
+      </w:r>
+    </w:p>
+    <w:p>
+      <w:pPr>
+        <w:pStyle w:val="SourceCode"/>
+      </w:pPr>
+      <w:r>
+        <w:rPr>
+          <w:rStyle w:val="VerbatimChar"/>
+        </w:rPr>
+        <w:t xml:space="preserve">$ curl [service].devhub.local</w:t>
+      </w:r>
+      <w:r>
+        <w:br/>
+      </w:r>
+      <w:r>
+        <w:rPr>
+          <w:rStyle w:val="VerbatimChar"/>
+        </w:rPr>
+        <w:t xml:space="preserve">[Réponse attendue : version stable]</w:t>
+      </w:r>
+      <w:r>
+        <w:br/>
+      </w:r>
+      <w:r>
+        <w:br/>
+      </w:r>
+      <w:r>
+        <w:rPr>
+          <w:rStyle w:val="VerbatimChar"/>
+        </w:rPr>
+        <w:t xml:space="preserve">$ curl -H "X-Beta-User: true" [service].devhub.local</w:t>
+      </w:r>
+      <w:r>
+        <w:br/>
+      </w:r>
+      <w:r>
+        <w:rPr>
+          <w:rStyle w:val="VerbatimChar"/>
+        </w:rPr>
+        <w:t xml:space="preserve">[Réponse attendue : version canary]</w:t>
+      </w:r>
+    </w:p>
+    <w:p>
+      <w:r>
+        <w:pict>
+          <v:rect style="width:0;height:1.5pt" o:hralign="center" o:hrstd="t" o:hr="t"/>
+        </w:pict>
       </w:r>
     </w:p>
     <w:bookmarkEnd w:id="55"/>
-    <w:bookmarkStart w:id="56" w:name="X2eadc02aa71306573a275a34697c4881cc775ab"/>
+    <w:bookmarkEnd w:id="56"/>
+    <w:bookmarkStart w:id="59" w:name="Xaa93b513a84bfd46879aafda0934d49925bde83"/>
+    <w:p>
+      <w:pPr>
+        <w:pStyle w:val="Heading2"/>
+      </w:pPr>
+      <w:r>
+        <w:t xml:space="preserve">Étape 10 — Alerting Alertmanager et notifications Rollouts</w:t>
+      </w:r>
+    </w:p>
+    <w:bookmarkStart w:id="57" w:name="X30991d32a017905e182502f8ac1bf66caedec37"/>
     <w:p>
       <w:pPr>
         <w:pStyle w:val="Heading3"/>
       </w:pPr>
       <w:r>
-        <w:t xml:space="preserve">2. Captures d’écrans des Webhooks de notifications</w:t>
+        <w:t xml:space="preserve">1. Fichiers et configurations de la chaîne d’alerte</w:t>
       </w:r>
     </w:p>
     <w:p>
@@ -3267,7 +3292,7 @@
           <w:b/>
           <w:bCs/>
         </w:rPr>
-        <w:t xml:space="preserve">Webhook primaire (Page / Alerte critique)</w:t>
+        <w:t xml:space="preserve">Lien vers les PrometheusRules</w:t>
       </w:r>
       <w:r>
         <w:t xml:space="preserve"> </w:t>
@@ -3280,10 +3305,9 @@
       </w:r>
       <w:r>
         <w:rPr>
-          <w:i/>
-          <w:iCs/>
-        </w:rPr>
-        <w:t xml:space="preserve">[Insérer la capture]</w:t>
+          <w:rStyle w:val="VerbatimChar"/>
+        </w:rPr>
+        <w:t xml:space="preserve">templates/prometheusrule.yaml</w:t>
       </w:r>
     </w:p>
     <w:p>
@@ -3299,7 +3323,7 @@
           <w:b/>
           <w:bCs/>
         </w:rPr>
-        <w:t xml:space="preserve">Webhook secondaire (Ticket / Alerte modérée)</w:t>
+        <w:t xml:space="preserve">Configuration d’Alertmanager</w:t>
       </w:r>
       <w:r>
         <w:t xml:space="preserve"> </w:t>
@@ -3312,10 +3336,9 @@
       </w:r>
       <w:r>
         <w:rPr>
-          <w:i/>
-          <w:iCs/>
-        </w:rPr>
-        <w:t xml:space="preserve">[Insérer la capture]</w:t>
+          <w:rStyle w:val="VerbatimChar"/>
+        </w:rPr>
+        <w:t xml:space="preserve">platform-sre/alertmanager-config.yaml</w:t>
       </w:r>
     </w:p>
     <w:p>
@@ -3331,6 +3354,111 @@
           <w:b/>
           <w:bCs/>
         </w:rPr>
+        <w:t xml:space="preserve">Configuration des notifications d’Argo Rollouts</w:t>
+      </w:r>
+      <w:r>
+        <w:t xml:space="preserve"> </w:t>
+      </w:r>
+      <w:r>
+        <w:t xml:space="preserve">:</w:t>
+      </w:r>
+      <w:r>
+        <w:t xml:space="preserve"> </w:t>
+      </w:r>
+      <w:r>
+        <w:rPr>
+          <w:rStyle w:val="VerbatimChar"/>
+        </w:rPr>
+        <w:t xml:space="preserve">platform-sre/rollouts-notifications.yaml</w:t>
+      </w:r>
+    </w:p>
+    <w:bookmarkEnd w:id="57"/>
+    <w:bookmarkStart w:id="58" w:name="X2eadc02aa71306573a275a34697c4881cc775ab"/>
+    <w:p>
+      <w:pPr>
+        <w:pStyle w:val="Heading3"/>
+      </w:pPr>
+      <w:r>
+        <w:t xml:space="preserve">2. Captures d’écrans des Webhooks de notifications</w:t>
+      </w:r>
+    </w:p>
+    <w:p>
+      <w:pPr>
+        <w:pStyle w:val="Compact"/>
+        <w:numPr>
+          <w:ilvl w:val="0"/>
+          <w:numId w:val="1014"/>
+        </w:numPr>
+      </w:pPr>
+      <w:r>
+        <w:rPr>
+          <w:b/>
+          <w:bCs/>
+        </w:rPr>
+        <w:t xml:space="preserve">Webhook primaire (Page / Alerte critique)</w:t>
+      </w:r>
+      <w:r>
+        <w:t xml:space="preserve"> </w:t>
+      </w:r>
+      <w:r>
+        <w:t xml:space="preserve">:</w:t>
+      </w:r>
+      <w:r>
+        <w:t xml:space="preserve"> </w:t>
+      </w:r>
+      <w:r>
+        <w:rPr>
+          <w:i/>
+          <w:iCs/>
+        </w:rPr>
+        <w:t xml:space="preserve">[Insérer la capture]</w:t>
+      </w:r>
+    </w:p>
+    <w:p>
+      <w:pPr>
+        <w:pStyle w:val="Compact"/>
+        <w:numPr>
+          <w:ilvl w:val="0"/>
+          <w:numId w:val="1014"/>
+        </w:numPr>
+      </w:pPr>
+      <w:r>
+        <w:rPr>
+          <w:b/>
+          <w:bCs/>
+        </w:rPr>
+        <w:t xml:space="preserve">Webhook secondaire (Ticket / Alerte modérée)</w:t>
+      </w:r>
+      <w:r>
+        <w:t xml:space="preserve"> </w:t>
+      </w:r>
+      <w:r>
+        <w:t xml:space="preserve">:</w:t>
+      </w:r>
+      <w:r>
+        <w:t xml:space="preserve"> </w:t>
+      </w:r>
+      <w:r>
+        <w:rPr>
+          <w:i/>
+          <w:iCs/>
+        </w:rPr>
+        <w:t xml:space="preserve">[Insérer la capture]</w:t>
+      </w:r>
+    </w:p>
+    <w:p>
+      <w:pPr>
+        <w:pStyle w:val="Compact"/>
+        <w:numPr>
+          <w:ilvl w:val="0"/>
+          <w:numId w:val="1014"/>
+        </w:numPr>
+      </w:pPr>
+      <w:r>
+        <w:rPr>
+          <w:b/>
+          <w:bCs/>
+        </w:rPr>
         <w:t xml:space="preserve">Webhook de notifications de déploiement</w:t>
       </w:r>
       <w:r>
@@ -3357,9 +3485,9 @@
         </w:pict>
       </w:r>
     </w:p>
-    <w:bookmarkEnd w:id="56"/>
-    <w:bookmarkEnd w:id="57"/>
-    <w:bookmarkStart w:id="59" w:name="X3d2815aee2ea9cd95ddfc31f554cd07bb58a689"/>
+    <w:bookmarkEnd w:id="58"/>
+    <w:bookmarkEnd w:id="59"/>
+    <w:bookmarkStart w:id="61" w:name="X3d2815aee2ea9cd95ddfc31f554cd07bb58a689"/>
     <w:p>
       <w:pPr>
         <w:pStyle w:val="Heading2"/>
@@ -3368,7 +3496,7 @@
         <w:t xml:space="preserve">Étape 11 — Comparer Argo Rollouts, Flagger et la Rolling-Update native</w:t>
       </w:r>
     </w:p>
-    <w:bookmarkStart w:id="58" w:name="matrice-dévaluation-complétée"/>
+    <w:bookmarkStart w:id="60" w:name="matrice-dévaluation-complétée"/>
     <w:p>
       <w:pPr>
         <w:pStyle w:val="Heading3"/>
@@ -4124,9 +4252,9 @@
         </w:pict>
       </w:r>
     </w:p>
-    <w:bookmarkEnd w:id="58"/>
-    <w:bookmarkEnd w:id="59"/>
-    <w:bookmarkStart w:id="63" w:name="Xc87492850197fa96825c3ac5c5ded493f2540da"/>
+    <w:bookmarkEnd w:id="60"/>
+    <w:bookmarkEnd w:id="61"/>
+    <w:bookmarkStart w:id="65" w:name="Xc87492850197fa96825c3ac5c5ded493f2540da"/>
     <w:p>
       <w:pPr>
         <w:pStyle w:val="Heading2"/>
@@ -4135,7 +4263,7 @@
         <w:t xml:space="preserve">Étape 12 — Synthèse obligatoire : « Ma chaîne de release est-elle production-ready ? »</w:t>
       </w:r>
     </w:p>
-    <w:bookmarkStart w:id="60" w:name="X34e60f19d0a21048df329588d062f86b6b54842"/>
+    <w:bookmarkStart w:id="62" w:name="X34e60f19d0a21048df329588d062f86b6b54842"/>
     <w:p>
       <w:pPr>
         <w:pStyle w:val="Heading3"/>
@@ -4156,8 +4284,8 @@
         <w:t xml:space="preserve">[Insérer vos commentaires pour chaque ligne du tableau de paradigmes.]</w:t>
       </w:r>
     </w:p>
-    <w:bookmarkEnd w:id="60"/>
-    <w:bookmarkStart w:id="61" w:name="Xb80e85dc3159bec82c3ba27134d88bdaf3f1424"/>
+    <w:bookmarkEnd w:id="62"/>
+    <w:bookmarkStart w:id="63" w:name="Xb80e85dc3159bec82c3ba27134d88bdaf3f1424"/>
     <w:p>
       <w:pPr>
         <w:pStyle w:val="Heading3"/>
@@ -4178,8 +4306,8 @@
         <w:t xml:space="preserve">[Analyse des 7 thèmes d’angles morts (Traçabilité distribuée, Loki, RUM, Chaos, Kyverno, Cosign, Velero) en 5 à 10 lignes par thème.]</w:t>
       </w:r>
     </w:p>
-    <w:bookmarkEnd w:id="61"/>
-    <w:bookmarkStart w:id="62" w:name="livrable-3-votre-position-darchitecte"/>
+    <w:bookmarkEnd w:id="63"/>
+    <w:bookmarkStart w:id="64" w:name="livrable-3-votre-position-darchitecte"/>
     <w:p>
       <w:pPr>
         <w:pStyle w:val="Heading3"/>
@@ -4200,9 +4328,9 @@
         <w:t xml:space="preserve">[Votre plaidoyer technique de 10 lignes maximum présentant les briques que vous conservez, remplacez ou ajoutez dans une architecture industrielle.]</w:t>
       </w:r>
     </w:p>
-    <w:bookmarkEnd w:id="62"/>
-    <w:bookmarkEnd w:id="63"/>
     <w:bookmarkEnd w:id="64"/>
+    <w:bookmarkEnd w:id="65"/>
+    <w:bookmarkEnd w:id="66"/>
     <w:sectPr>
       <w:footnotePr>
         <w:numRestart w:val="eachSect"/>
@@ -4568,6 +4696,9 @@
     <w:abstractNumId w:val="991"/>
   </w:num>
   <w:num w:numId="1013">
+    <w:abstractNumId w:val="991"/>
+  </w:num>
+  <w:num w:numId="1014">
     <w:abstractNumId w:val="991"/>
   </w:num>
 </w:numbering>

</xml_diff>